<commit_message>
My Smart City Traffic Analytics Project File Update
</commit_message>
<xml_diff>
--- a/01_Business_Context/5_Business Questions/Smart_City_Traffic_Analytics_Business_Questions.docx
+++ b/01_Business_Context/5_Business Questions/Smart_City_Traffic_Analytics_Business_Questions.docx
@@ -1,6 +1,6 @@
 
 <file path=word/document.xml><?xml version="1.0" encoding="utf-8"?>
-<w:document xmlns:wpc="http://schemas.microsoft.com/office/word/2010/wordprocessingCanvas" xmlns:mc="http://schemas.openxmlformats.org/markup-compatibility/2006" xmlns:o="urn:schemas-microsoft-com:office:office" xmlns:r="http://schemas.openxmlformats.org/officeDocument/2006/relationships" xmlns:m="http://schemas.openxmlformats.org/officeDocument/2006/math" xmlns:v="urn:schemas-microsoft-com:vml" xmlns:wp14="http://schemas.microsoft.com/office/word/2010/wordprocessingDrawing" xmlns:wp="http://schemas.openxmlformats.org/drawingml/2006/wordprocessingDrawing" xmlns:w10="urn:schemas-microsoft-com:office:word" xmlns:w="http://schemas.openxmlformats.org/wordprocessingml/2006/main" xmlns:w14="http://schemas.microsoft.com/office/word/2010/wordml" xmlns:w15="http://schemas.microsoft.com/office/word/2012/wordml" xmlns:wpg="http://schemas.microsoft.com/office/word/2010/wordprocessingGroup" xmlns:wpi="http://schemas.microsoft.com/office/word/2010/wordprocessingInk" xmlns:wne="http://schemas.microsoft.com/office/word/2006/wordml" xmlns:wps="http://schemas.microsoft.com/office/word/2010/wordprocessingShape" xmlns:cx="http://schemas.microsoft.com/office/drawing/2014/chartex" xmlns:cx1="http://schemas.microsoft.com/office/drawing/2015/9/8/chartex" xmlns:cx2="http://schemas.microsoft.com/office/drawing/2015/10/21/chartex" xmlns:cx3="http://schemas.microsoft.com/office/drawing/2016/5/9/chartex" xmlns:cx4="http://schemas.microsoft.com/office/drawing/2016/5/10/chartex" xmlns:cx5="http://schemas.microsoft.com/office/drawing/2016/5/11/chartex" xmlns:cx6="http://schemas.microsoft.com/office/drawing/2016/5/12/chartex" xmlns:cx7="http://schemas.microsoft.com/office/drawing/2016/5/13/chartex" xmlns:cx8="http://schemas.microsoft.com/office/drawing/2016/5/14/chartex" xmlns:aink="http://schemas.microsoft.com/office/drawing/2016/ink" xmlns:am3d="http://schemas.microsoft.com/office/drawing/2017/model3d" xmlns:w16cex="http://schemas.microsoft.com/office/word/2018/wordml/cex" xmlns:w16cid="http://schemas.microsoft.com/office/word/2016/wordml/cid" xmlns:w16="http://schemas.microsoft.com/office/word/2018/wordml" xmlns:w16sdtdh="http://schemas.microsoft.com/office/word/2020/wordml/sdtdatahash" xmlns:w16se="http://schemas.microsoft.com/office/word/2015/wordml/symex" mc:Ignorable="w14 w15 wp14">
+<w:document xmlns:wpc="http://schemas.microsoft.com/office/word/2010/wordprocessingCanvas" xmlns:cx="http://schemas.microsoft.com/office/drawing/2014/chartex" xmlns:cx1="http://schemas.microsoft.com/office/drawing/2015/9/8/chartex" xmlns:cx2="http://schemas.microsoft.com/office/drawing/2015/10/21/chartex" xmlns:cx3="http://schemas.microsoft.com/office/drawing/2016/5/9/chartex" xmlns:cx4="http://schemas.microsoft.com/office/drawing/2016/5/10/chartex" xmlns:cx5="http://schemas.microsoft.com/office/drawing/2016/5/11/chartex" xmlns:cx6="http://schemas.microsoft.com/office/drawing/2016/5/12/chartex" xmlns:cx7="http://schemas.microsoft.com/office/drawing/2016/5/13/chartex" xmlns:cx8="http://schemas.microsoft.com/office/drawing/2016/5/14/chartex" xmlns:mc="http://schemas.openxmlformats.org/markup-compatibility/2006" xmlns:aink="http://schemas.microsoft.com/office/drawing/2016/ink" xmlns:am3d="http://schemas.microsoft.com/office/drawing/2017/model3d" xmlns:o="urn:schemas-microsoft-com:office:office" xmlns:oel="http://schemas.microsoft.com/office/2019/extlst" xmlns:r="http://schemas.openxmlformats.org/officeDocument/2006/relationships" xmlns:m="http://schemas.openxmlformats.org/officeDocument/2006/math" xmlns:v="urn:schemas-microsoft-com:vml" xmlns:wp14="http://schemas.microsoft.com/office/word/2010/wordprocessingDrawing" xmlns:wp="http://schemas.openxmlformats.org/drawingml/2006/wordprocessingDrawing" xmlns:w10="urn:schemas-microsoft-com:office:word" xmlns:w="http://schemas.openxmlformats.org/wordprocessingml/2006/main" xmlns:w14="http://schemas.microsoft.com/office/word/2010/wordml" xmlns:w15="http://schemas.microsoft.com/office/word/2012/wordml" xmlns:w16cex="http://schemas.microsoft.com/office/word/2018/wordml/cex" xmlns:w16cid="http://schemas.microsoft.com/office/word/2016/wordml/cid" xmlns:w16="http://schemas.microsoft.com/office/word/2018/wordml" xmlns:w16sdtdh="http://schemas.microsoft.com/office/word/2020/wordml/sdtdatahash" xmlns:w16se="http://schemas.microsoft.com/office/word/2015/wordml/symex" xmlns:wpg="http://schemas.microsoft.com/office/word/2010/wordprocessingGroup" xmlns:wpi="http://schemas.microsoft.com/office/word/2010/wordprocessingInk" xmlns:wne="http://schemas.microsoft.com/office/word/2006/wordml" xmlns:wps="http://schemas.microsoft.com/office/word/2010/wordprocessingShape" mc:Ignorable="w14 w15 w16se w16cid w16 w16cex w16sdtdh wp14">
   <w:body>
     <w:p>
       <w:pPr>
@@ -15,7 +15,7 @@
           <w:sz w:val="40"/>
           <w:szCs w:val="40"/>
         </w:rPr>
-        <w:t xml:space="preserve">Smart City Traffic Analytics</w:t>
+        <w:t>Smart City Traffic Analytics</w:t>
       </w:r>
     </w:p>
     <w:p>
@@ -31,16 +31,16 @@
           <w:sz w:val="24"/>
           <w:szCs w:val="24"/>
         </w:rPr>
-        <w:t xml:space="preserve">Business Questions</w:t>
+        <w:t>Business Questions</w:t>
       </w:r>
     </w:p>
     <w:p>
       <w:pPr>
         <w:pStyle w:val="Heading1"/>
         <w:pBdr>
-          <w:bottom w:val="single" w:color="2E74B5" w:sz="6" w:space="4"/>
+          <w:bottom w:val="single" w:sz="6" w:space="4" w:color="2E74B5"/>
         </w:pBdr>
-        <w:spacing w:after="100" w:before="240"/>
+        <w:spacing w:before="240" w:after="100"/>
       </w:pPr>
       <w:r>
         <w:rPr>
@@ -50,12 +50,12 @@
           <w:sz w:val="26"/>
           <w:szCs w:val="26"/>
         </w:rPr>
-        <w:t xml:space="preserve">Business Questions — Indian Roads Accident Dataset</w:t>
-      </w:r>
-    </w:p>
-    <w:p>
-      <w:pPr>
-        <w:spacing w:after="50" w:before="140"/>
+        <w:t>Business Questions — Indian Roads Accident Dataset</w:t>
+      </w:r>
+    </w:p>
+    <w:p>
+      <w:pPr>
+        <w:spacing w:before="140" w:after="50"/>
       </w:pPr>
       <w:r>
         <w:rPr>
@@ -65,7 +65,7 @@
           <w:sz w:val="21"/>
           <w:szCs w:val="21"/>
         </w:rPr>
-        <w:t xml:space="preserve">Descriptive (What is happening?)</w:t>
+        <w:t>Descriptive (What is happening?)</w:t>
       </w:r>
     </w:p>
     <w:p>
@@ -80,10 +80,8 @@
       <w:r>
         <w:rPr>
           <w:color w:val="262626"/>
-          <w:sz w:val="20"/>
-          <w:szCs w:val="20"/>
-        </w:rPr>
-        <w:t xml:space="preserve">Which cities and states report the highest number and highest severity of accidents?</w:t>
+        </w:rPr>
+        <w:t>Which cities and states report the highest number and highest severity of accidents?</w:t>
       </w:r>
     </w:p>
     <w:p>
@@ -98,10 +96,8 @@
       <w:r>
         <w:rPr>
           <w:color w:val="262626"/>
-          <w:sz w:val="20"/>
-          <w:szCs w:val="20"/>
-        </w:rPr>
-        <w:t xml:space="preserve">What is the overall distribution of accident severity (Minor / Major / Fatal) across the dataset?</w:t>
+        </w:rPr>
+        <w:t>What is the overall distribution of accident severity (Minor / Major / Fatal) across the dataset?</w:t>
       </w:r>
     </w:p>
     <w:p>
@@ -116,15 +112,13 @@
       <w:r>
         <w:rPr>
           <w:color w:val="262626"/>
-          <w:sz w:val="20"/>
-          <w:szCs w:val="20"/>
-        </w:rPr>
-        <w:t xml:space="preserve">What are the most common causes of accidents, and how do they vary by road type?</w:t>
-      </w:r>
-    </w:p>
-    <w:p>
-      <w:pPr>
-        <w:spacing w:after="50" w:before="140"/>
+        </w:rPr>
+        <w:t>What are the most common causes of accidents, and how do they vary by road type?</w:t>
+      </w:r>
+    </w:p>
+    <w:p>
+      <w:pPr>
+        <w:spacing w:before="140" w:after="50"/>
       </w:pPr>
       <w:r>
         <w:rPr>
@@ -134,7 +128,7 @@
           <w:sz w:val="21"/>
           <w:szCs w:val="21"/>
         </w:rPr>
-        <w:t xml:space="preserve">Diagnostic (Why is it happening?)</w:t>
+        <w:t>Diagnostic (Why is it happening?)</w:t>
       </w:r>
     </w:p>
     <w:p>
@@ -149,10 +143,8 @@
       <w:r>
         <w:rPr>
           <w:color w:val="262626"/>
-          <w:sz w:val="20"/>
-          <w:szCs w:val="20"/>
-        </w:rPr>
-        <w:t xml:space="preserve">Why do certain road types (Highway vs. Urban vs. Rural) show different severity patterns?</w:t>
+        </w:rPr>
+        <w:t>Why do certain road types (Highway vs. Urban vs. Rural) show different severity patterns?</w:t>
       </w:r>
     </w:p>
     <w:p>
@@ -167,10 +159,8 @@
       <w:r>
         <w:rPr>
           <w:color w:val="262626"/>
-          <w:sz w:val="20"/>
-          <w:szCs w:val="20"/>
-        </w:rPr>
-        <w:t xml:space="preserve">Why do accidents during Fog or Rain result in higher severity than Clear weather?</w:t>
+        </w:rPr>
+        <w:t>Why do accidents during Fog or Rain result in higher severity than Clear weather?</w:t>
       </w:r>
     </w:p>
     <w:p>
@@ -185,10 +175,8 @@
       <w:r>
         <w:rPr>
           <w:color w:val="262626"/>
-          <w:sz w:val="20"/>
-          <w:szCs w:val="20"/>
-        </w:rPr>
-        <w:t xml:space="preserve">Why are peak-hour and weekend accidents more/less severe than off-peak weekday accidents?</w:t>
+        </w:rPr>
+        <w:t>Why are peak-hour and weekend accidents more/less severe than off-peak weekday accidents?</w:t>
       </w:r>
     </w:p>
     <w:p>
@@ -203,15 +191,13 @@
       <w:r>
         <w:rPr>
           <w:color w:val="262626"/>
-          <w:sz w:val="20"/>
-          <w:szCs w:val="20"/>
-        </w:rPr>
-        <w:t xml:space="preserve">Does the presence of a traffic signal reduce accident severity, and if not, why not?</w:t>
-      </w:r>
-    </w:p>
-    <w:p>
-      <w:pPr>
-        <w:spacing w:after="50" w:before="140"/>
+        </w:rPr>
+        <w:t>Does the presence of a traffic signal reduce accident severity, and if not, why not?</w:t>
+      </w:r>
+    </w:p>
+    <w:p>
+      <w:pPr>
+        <w:spacing w:before="140" w:after="50"/>
       </w:pPr>
       <w:r>
         <w:rPr>
@@ -221,7 +207,7 @@
           <w:sz w:val="21"/>
           <w:szCs w:val="21"/>
         </w:rPr>
-        <w:t xml:space="preserve">Predictive (What is likely to happen?)</w:t>
+        <w:t>Predictive (What is likely to happen?)</w:t>
       </w:r>
     </w:p>
     <w:p>
@@ -236,10 +222,8 @@
       <w:r>
         <w:rPr>
           <w:color w:val="262626"/>
-          <w:sz w:val="20"/>
-          <w:szCs w:val="20"/>
-        </w:rPr>
-        <w:t xml:space="preserve">Which city, road type, and weather combinations are likely to produce the next high-risk_score incidents?</w:t>
+        </w:rPr>
+        <w:t>Which city, road type, and weather combinations are likely to produce the next high-risk_score incidents?</w:t>
       </w:r>
     </w:p>
     <w:p>
@@ -254,15 +238,13 @@
       <w:r>
         <w:rPr>
           <w:color w:val="262626"/>
-          <w:sz w:val="20"/>
-          <w:szCs w:val="20"/>
-        </w:rPr>
-        <w:t xml:space="preserve">Can time-of-day and festival-period patterns predict spikes in accident volume?</w:t>
-      </w:r>
-    </w:p>
-    <w:p>
-      <w:pPr>
-        <w:spacing w:after="50" w:before="140"/>
+        </w:rPr>
+        <w:t>Can time-of-day and festival-period patterns predict spikes in accident volume?</w:t>
+      </w:r>
+    </w:p>
+    <w:p>
+      <w:pPr>
+        <w:spacing w:before="140" w:after="50"/>
       </w:pPr>
       <w:r>
         <w:rPr>
@@ -272,7 +254,7 @@
           <w:sz w:val="21"/>
           <w:szCs w:val="21"/>
         </w:rPr>
-        <w:t xml:space="preserve">Prescriptive (What should we do about it?)</w:t>
+        <w:t>Prescriptive (What should we do about it?)</w:t>
       </w:r>
     </w:p>
     <w:p>
@@ -287,10 +269,8 @@
       <w:r>
         <w:rPr>
           <w:color w:val="262626"/>
-          <w:sz w:val="20"/>
-          <w:szCs w:val="20"/>
-        </w:rPr>
-        <w:t xml:space="preserve">Where should traffic police prioritize patrol deployment to reduce Fatal accidents?</w:t>
+        </w:rPr>
+        <w:t>Where should traffic police prioritize patrol deployment to reduce Fatal accidents?</w:t>
       </w:r>
     </w:p>
     <w:p>
@@ -305,10 +285,8 @@
       <w:r>
         <w:rPr>
           <w:color w:val="262626"/>
-          <w:sz w:val="20"/>
-          <w:szCs w:val="20"/>
-        </w:rPr>
-        <w:t xml:space="preserve">Which roads should be prioritized for signage, lighting, or signal upgrades based on risk score?</w:t>
+        </w:rPr>
+        <w:t>Which roads should be prioritized for signage, lighting, or signal upgrades based on risk score?</w:t>
       </w:r>
     </w:p>
     <w:p>
@@ -323,19 +301,29 @@
       <w:r>
         <w:rPr>
           <w:color w:val="262626"/>
-          <w:sz w:val="20"/>
-          <w:szCs w:val="20"/>
-        </w:rPr>
-        <w:t xml:space="preserve">What safety campaigns (overspeeding, drunk driving, distraction) should be prioritized by city?</w:t>
+        </w:rPr>
+        <w:t>What safety campaigns (</w:t>
+      </w:r>
+      <w:r>
+        <w:rPr>
+          <w:color w:val="262626"/>
+        </w:rPr>
+        <w:t>over speeding</w:t>
+      </w:r>
+      <w:r>
+        <w:rPr>
+          <w:color w:val="262626"/>
+        </w:rPr>
+        <w:t>, drunk driving, distraction) should be prioritized by city?</w:t>
       </w:r>
     </w:p>
     <w:p>
       <w:pPr>
         <w:pStyle w:val="Heading1"/>
         <w:pBdr>
-          <w:bottom w:val="single" w:color="2E74B5" w:sz="6" w:space="4"/>
+          <w:bottom w:val="single" w:sz="6" w:space="4" w:color="2E74B5"/>
         </w:pBdr>
-        <w:spacing w:after="100" w:before="240"/>
+        <w:spacing w:before="240" w:after="100"/>
       </w:pPr>
       <w:r>
         <w:rPr>
@@ -345,12 +333,12 @@
           <w:sz w:val="26"/>
           <w:szCs w:val="26"/>
         </w:rPr>
-        <w:t xml:space="preserve">Business Questions — Smart Mobility Dataset</w:t>
-      </w:r>
-    </w:p>
-    <w:p>
-      <w:pPr>
-        <w:spacing w:after="50" w:before="140"/>
+        <w:t>Business Questions — Smart Mobility Dataset</w:t>
+      </w:r>
+    </w:p>
+    <w:p>
+      <w:pPr>
+        <w:spacing w:before="140" w:after="50"/>
       </w:pPr>
       <w:r>
         <w:rPr>
@@ -360,7 +348,7 @@
           <w:sz w:val="21"/>
           <w:szCs w:val="21"/>
         </w:rPr>
-        <w:t xml:space="preserve">Descriptive (What is happening?)</w:t>
+        <w:t>Descriptive (What is happening?)</w:t>
       </w:r>
     </w:p>
     <w:p>
@@ -375,10 +363,8 @@
       <w:r>
         <w:rPr>
           <w:color w:val="262626"/>
-          <w:sz w:val="20"/>
-          <w:szCs w:val="20"/>
-        </w:rPr>
-        <w:t xml:space="preserve">What proportion of recorded time intervals fall into High, Medium, and Low traffic conditions?</w:t>
+        </w:rPr>
+        <w:t>What proportion of recorded time intervals fall into High, Medium, and Low traffic conditions?</w:t>
       </w:r>
     </w:p>
     <w:p>
@@ -393,10 +379,8 @@
       <w:r>
         <w:rPr>
           <w:color w:val="262626"/>
-          <w:sz w:val="20"/>
-          <w:szCs w:val="20"/>
-        </w:rPr>
-        <w:t xml:space="preserve">What is the average vehicle count, traffic speed, and road occupancy across the monitored period?</w:t>
+        </w:rPr>
+        <w:t>What is the average vehicle count, traffic speed, and road occupancy across the monitored period?</w:t>
       </w:r>
     </w:p>
     <w:p>
@@ -411,15 +395,13 @@
       <w:r>
         <w:rPr>
           <w:color w:val="262626"/>
-          <w:sz w:val="20"/>
-          <w:szCs w:val="20"/>
-        </w:rPr>
-        <w:t xml:space="preserve">How does traffic condition vary by weather (Clear, Rain, Fog, Snow)?</w:t>
-      </w:r>
-    </w:p>
-    <w:p>
-      <w:pPr>
-        <w:spacing w:after="50" w:before="140"/>
+        </w:rPr>
+        <w:t>How does traffic condition vary by weather (Clear, Rain, Fog, Snow)?</w:t>
+      </w:r>
+    </w:p>
+    <w:p>
+      <w:pPr>
+        <w:spacing w:before="140" w:after="50"/>
       </w:pPr>
       <w:r>
         <w:rPr>
@@ -429,7 +411,7 @@
           <w:sz w:val="21"/>
           <w:szCs w:val="21"/>
         </w:rPr>
-        <w:t xml:space="preserve">Diagnostic (Why is it happening?)</w:t>
+        <w:t>Diagnostic (Why is it happening?)</w:t>
       </w:r>
     </w:p>
     <w:p>
@@ -444,10 +426,8 @@
       <w:r>
         <w:rPr>
           <w:color w:val="262626"/>
-          <w:sz w:val="20"/>
-          <w:szCs w:val="20"/>
-        </w:rPr>
-        <w:t xml:space="preserve">Why does road occupancy correlate with lower traffic speed, and at what occupancy level does speed drop sharply?</w:t>
+        </w:rPr>
+        <w:t>Why does road occupancy correlate with lower traffic speed, and at what occupancy level does speed drop sharply?</w:t>
       </w:r>
     </w:p>
     <w:p>
@@ -462,10 +442,8 @@
       <w:r>
         <w:rPr>
           <w:color w:val="262626"/>
-          <w:sz w:val="20"/>
-          <w:szCs w:val="20"/>
-        </w:rPr>
-        <w:t xml:space="preserve">Why do certain traffic light states (Red/Yellow/Green) coincide with higher accident reports?</w:t>
+        </w:rPr>
+        <w:t>Why do certain traffic light states (Red/Yellow/Green) coincide with higher accident reports?</w:t>
       </w:r>
     </w:p>
     <w:p>
@@ -480,15 +458,13 @@
       <w:r>
         <w:rPr>
           <w:color w:val="262626"/>
-          <w:sz w:val="20"/>
-          <w:szCs w:val="20"/>
-        </w:rPr>
-        <w:t xml:space="preserve">Why do emissions and energy consumption rise disproportionately during High congestion periods?</w:t>
-      </w:r>
-    </w:p>
-    <w:p>
-      <w:pPr>
-        <w:spacing w:after="50" w:before="140"/>
+        </w:rPr>
+        <w:t>Why do emissions and energy consumption rise disproportionately during High congestion periods?</w:t>
+      </w:r>
+    </w:p>
+    <w:p>
+      <w:pPr>
+        <w:spacing w:before="140" w:after="50"/>
       </w:pPr>
       <w:r>
         <w:rPr>
@@ -498,7 +474,7 @@
           <w:sz w:val="21"/>
           <w:szCs w:val="21"/>
         </w:rPr>
-        <w:t xml:space="preserve">Predictive (What is likely to happen?)</w:t>
+        <w:t>Predictive (What is likely to happen?)</w:t>
       </w:r>
     </w:p>
     <w:p>
@@ -513,10 +489,8 @@
       <w:r>
         <w:rPr>
           <w:color w:val="262626"/>
-          <w:sz w:val="20"/>
-          <w:szCs w:val="20"/>
-        </w:rPr>
-        <w:t xml:space="preserve">Can current traffic speed and occupancy patterns predict when a corridor will shift into High congestion?</w:t>
+        </w:rPr>
+        <w:t>Can current traffic speed and occupancy patterns predict when a corridor will shift into High congestion?</w:t>
       </w:r>
     </w:p>
     <w:p>
@@ -531,15 +505,13 @@
       <w:r>
         <w:rPr>
           <w:color w:val="262626"/>
-          <w:sz w:val="20"/>
-          <w:szCs w:val="20"/>
-        </w:rPr>
-        <w:t xml:space="preserve">Can ride-sharing demand patterns predict parking availability shortages at specific times?</w:t>
-      </w:r>
-    </w:p>
-    <w:p>
-      <w:pPr>
-        <w:spacing w:after="50" w:before="140"/>
+        </w:rPr>
+        <w:t>Can ride-sharing demand patterns predict parking availability shortages at specific times?</w:t>
+      </w:r>
+    </w:p>
+    <w:p>
+      <w:pPr>
+        <w:spacing w:before="140" w:after="50"/>
       </w:pPr>
       <w:r>
         <w:rPr>
@@ -549,7 +521,7 @@
           <w:sz w:val="21"/>
           <w:szCs w:val="21"/>
         </w:rPr>
-        <w:t xml:space="preserve">Prescriptive (What should we do about it?)</w:t>
+        <w:t>Prescriptive (What should we do about it?)</w:t>
       </w:r>
     </w:p>
     <w:p>
@@ -564,10 +536,8 @@
       <w:r>
         <w:rPr>
           <w:color w:val="262626"/>
-          <w:sz w:val="20"/>
-          <w:szCs w:val="20"/>
-        </w:rPr>
-        <w:t xml:space="preserve">Where and when should traffic signal timing be adjusted to reduce congestion?</w:t>
+        </w:rPr>
+        <w:t>Where and when should traffic signal timing be adjusted to reduce congestion?</w:t>
       </w:r>
     </w:p>
     <w:p>
@@ -582,10 +552,8 @@
       <w:r>
         <w:rPr>
           <w:color w:val="262626"/>
-          <w:sz w:val="20"/>
-          <w:szCs w:val="20"/>
-        </w:rPr>
-        <w:t xml:space="preserve">Where should ride-sharing fleets be repositioned ahead of predicted demand peaks?</w:t>
+        </w:rPr>
+        <w:t>Where should ride-sharing fleets be repositioned ahead of predicted demand peaks?</w:t>
       </w:r>
     </w:p>
     <w:p>
@@ -600,19 +568,17 @@
       <w:r>
         <w:rPr>
           <w:color w:val="262626"/>
-          <w:sz w:val="20"/>
-          <w:szCs w:val="20"/>
-        </w:rPr>
-        <w:t xml:space="preserve">Which congestion conditions justify emissions-reduction interventions (e.g. rerouting, congestion pricing)?</w:t>
+        </w:rPr>
+        <w:t>Which congestion conditions justify emissions-reduction interventions (e.g. rerouting, congestion pricing)?</w:t>
       </w:r>
     </w:p>
     <w:p>
       <w:pPr>
         <w:pStyle w:val="Heading1"/>
         <w:pBdr>
-          <w:bottom w:val="single" w:color="2E74B5" w:sz="6" w:space="4"/>
+          <w:bottom w:val="single" w:sz="6" w:space="4" w:color="2E74B5"/>
         </w:pBdr>
-        <w:spacing w:after="100" w:before="240"/>
+        <w:spacing w:before="240" w:after="100"/>
       </w:pPr>
       <w:r>
         <w:rPr>
@@ -622,7 +588,7 @@
           <w:sz w:val="26"/>
           <w:szCs w:val="26"/>
         </w:rPr>
-        <w:t xml:space="preserve">Overarching Cross-Dataset Business Question</w:t>
+        <w:t>Overarching Cross-Dataset Business Question</w:t>
       </w:r>
     </w:p>
     <w:p>
@@ -634,105 +600,81 @@
           <w:i/>
           <w:iCs/>
           <w:color w:val="262626"/>
-          <w:sz w:val="20"/>
-          <w:szCs w:val="20"/>
-        </w:rPr>
-        <w:t xml:space="preserve">How can accident risk patterns (Indian Roads dataset) and real-time traffic/congestion patterns (Smart Mobility dataset) be combined into a single risk-and-flow view that helps a city simultaneously reduce accidents, cut congestion, and lower emissions?</w:t>
+        </w:rPr>
+        <w:t>How can accident risk patterns (Indian Roads dataset) and real-time traffic/congestion patterns (Smart Mobility dataset) be combined into a single risk-and-flow view that helps a city simultaneously reduce accidents, cut congestion, and lower emissions?</w:t>
       </w:r>
     </w:p>
     <w:sectPr>
-      <w:pgSz w:w="12240" w:h="15840" w:orient="portrait"/>
+      <w:pgSz w:w="12240" w:h="15840"/>
       <w:pgMar w:top="720" w:right="900" w:bottom="720" w:left="900" w:header="708" w:footer="708" w:gutter="0"/>
-      <w:pgNumType/>
+      <w:cols w:space="720"/>
       <w:docGrid w:linePitch="360"/>
     </w:sectPr>
   </w:body>
 </w:document>
 </file>
 
-<file path=word/comments.xml><?xml version="1.0" encoding="utf-8"?>
-<w:comments xmlns:cx="http://schemas.microsoft.com/office/drawing/2014/chartex" xmlns:cx1="http://schemas.microsoft.com/office/drawing/2015/9/8/chartex" xmlns:cx2="http://schemas.microsoft.com/office/drawing/2015/10/21/chartex" xmlns:cx3="http://schemas.microsoft.com/office/drawing/2016/5/9/chartex" xmlns:cx4="http://schemas.microsoft.com/office/drawing/2016/5/10/chartex" xmlns:cx5="http://schemas.microsoft.com/office/drawing/2016/5/11/chartex" xmlns:cx6="http://schemas.microsoft.com/office/drawing/2016/5/12/chartex" xmlns:cx7="http://schemas.microsoft.com/office/drawing/2016/5/13/chartex" xmlns:cx8="http://schemas.microsoft.com/office/drawing/2016/5/14/chartex" xmlns:mc="http://schemas.openxmlformats.org/markup-compatibility/2006" xmlns:aink="http://schemas.microsoft.com/office/drawing/2016/ink" xmlns:am3d="http://schemas.microsoft.com/office/drawing/2017/model3d" xmlns:o="urn:schemas-microsoft-com:office:office" xmlns:r="http://schemas.openxmlformats.org/officeDocument/2006/relationships" xmlns:m="http://schemas.openxmlformats.org/officeDocument/2006/math" xmlns:v="urn:schemas-microsoft-com:vml" xmlns:wp14="http://schemas.microsoft.com/office/word/2010/wordprocessingDrawing" xmlns:wp="http://schemas.openxmlformats.org/drawingml/2006/wordprocessingDrawing" xmlns:w10="urn:schemas-microsoft-com:office:word" xmlns:w="http://schemas.openxmlformats.org/wordprocessingml/2006/main" xmlns:w14="http://schemas.microsoft.com/office/word/2010/wordml" xmlns:w15="http://schemas.microsoft.com/office/word/2012/wordml" xmlns:w16cex="http://schemas.microsoft.com/office/word/2018/wordml/cex" xmlns:w16cid="http://schemas.microsoft.com/office/word/2016/wordml/cid" xmlns:w16="http://schemas.microsoft.com/office/word/2018/wordml" xmlns:w16sdtdh="http://schemas.microsoft.com/office/word/2020/wordml/sdtdatahash" xmlns:w16se="http://schemas.microsoft.com/office/word/2015/wordml/symex" xmlns:wpg="http://schemas.microsoft.com/office/word/2010/wordprocessingGroup" xmlns:wpi="http://schemas.microsoft.com/office/word/2010/wordprocessingInk" xmlns:wne="http://schemas.microsoft.com/office/word/2006/wordml" xmlns:wps="http://schemas.microsoft.com/office/word/2010/wordprocessingShape"/>
-</file>
-
-<file path=word/endnotes.xml><?xml version="1.0" encoding="utf-8"?>
-<w:endnotes xmlns:wpc="http://schemas.microsoft.com/office/word/2010/wordprocessingCanvas" xmlns:mc="http://schemas.openxmlformats.org/markup-compatibility/2006" xmlns:o="urn:schemas-microsoft-com:office:office" xmlns:r="http://schemas.openxmlformats.org/officeDocument/2006/relationships" xmlns:m="http://schemas.openxmlformats.org/officeDocument/2006/math" xmlns:v="urn:schemas-microsoft-com:vml" xmlns:wp14="http://schemas.microsoft.com/office/word/2010/wordprocessingDrawing" xmlns:wp="http://schemas.openxmlformats.org/drawingml/2006/wordprocessingDrawing" xmlns:w10="urn:schemas-microsoft-com:office:word" xmlns:w="http://schemas.openxmlformats.org/wordprocessingml/2006/main" xmlns:w14="http://schemas.microsoft.com/office/word/2010/wordml" xmlns:w15="http://schemas.microsoft.com/office/word/2012/wordml" xmlns:wpg="http://schemas.microsoft.com/office/word/2010/wordprocessingGroup" xmlns:wpi="http://schemas.microsoft.com/office/word/2010/wordprocessingInk" xmlns:wne="http://schemas.microsoft.com/office/word/2006/wordml" xmlns:wps="http://schemas.microsoft.com/office/word/2010/wordprocessingShape" mc:Ignorable="w14 w15 wp14">
-  <w:endnote w:type="separator" w:id="-1">
-    <w:p>
-      <w:pPr>
-        <w:spacing w:after="0" w:line="240" w:lineRule="auto"/>
-      </w:pPr>
-      <w:r>
-        <w:rPr>
-          <w:rStyle w:val="EndnoteReference"/>
-        </w:rPr>
-        <w:endnoteRef/>
-      </w:r>
-      <w:r>
-        <w:separator/>
-      </w:r>
-    </w:p>
-  </w:endnote>
-  <w:endnote w:type="continuationSeparator" w:id="0">
-    <w:p>
-      <w:pPr>
-        <w:spacing w:after="0" w:line="240" w:lineRule="auto"/>
-      </w:pPr>
-      <w:r>
-        <w:rPr>
-          <w:rStyle w:val="EndnoteReference"/>
-        </w:rPr>
-        <w:endnoteRef/>
-      </w:r>
-      <w:r>
-        <w:continuationSeparator/>
-      </w:r>
-    </w:p>
-  </w:endnote>
-</w:endnotes>
-</file>
-
-<file path=word/footnotes.xml><?xml version="1.0" encoding="utf-8"?>
-<w:footnotes xmlns:wpc="http://schemas.microsoft.com/office/word/2010/wordprocessingCanvas" xmlns:mc="http://schemas.openxmlformats.org/markup-compatibility/2006" xmlns:o="urn:schemas-microsoft-com:office:office" xmlns:r="http://schemas.openxmlformats.org/officeDocument/2006/relationships" xmlns:m="http://schemas.openxmlformats.org/officeDocument/2006/math" xmlns:v="urn:schemas-microsoft-com:vml" xmlns:wp14="http://schemas.microsoft.com/office/word/2010/wordprocessingDrawing" xmlns:wp="http://schemas.openxmlformats.org/drawingml/2006/wordprocessingDrawing" xmlns:w10="urn:schemas-microsoft-com:office:word" xmlns:w="http://schemas.openxmlformats.org/wordprocessingml/2006/main" xmlns:w14="http://schemas.microsoft.com/office/word/2010/wordml" xmlns:w15="http://schemas.microsoft.com/office/word/2012/wordml" xmlns:wpg="http://schemas.microsoft.com/office/word/2010/wordprocessingGroup" xmlns:wpi="http://schemas.microsoft.com/office/word/2010/wordprocessingInk" xmlns:wne="http://schemas.microsoft.com/office/word/2006/wordml" xmlns:wps="http://schemas.microsoft.com/office/word/2010/wordprocessingShape" mc:Ignorable="w14 w15 wp14">
-  <w:footnote w:type="separator" w:id="-1">
-    <w:p>
-      <w:pPr>
-        <w:spacing w:after="0" w:line="240" w:lineRule="auto"/>
-      </w:pPr>
-      <w:r>
-        <w:rPr>
-          <w:rStyle w:val="FootnoteReference"/>
-        </w:rPr>
-        <w:footnoteRef/>
-      </w:r>
-      <w:r>
-        <w:separator/>
-      </w:r>
-    </w:p>
-  </w:footnote>
-  <w:footnote w:type="continuationSeparator" w:id="0">
-    <w:p>
-      <w:pPr>
-        <w:spacing w:after="0" w:line="240" w:lineRule="auto"/>
-      </w:pPr>
-      <w:r>
-        <w:rPr>
-          <w:rStyle w:val="FootnoteReference"/>
-        </w:rPr>
-        <w:footnoteRef/>
-      </w:r>
-      <w:r>
-        <w:continuationSeparator/>
-      </w:r>
-    </w:p>
-  </w:footnote>
-</w:footnotes>
-</file>
-
 <file path=word/numbering.xml><?xml version="1.0" encoding="utf-8"?>
-<w:numbering xmlns:wpc="http://schemas.microsoft.com/office/word/2010/wordprocessingCanvas" xmlns:mc="http://schemas.openxmlformats.org/markup-compatibility/2006" xmlns:o="urn:schemas-microsoft-com:office:office" xmlns:r="http://schemas.openxmlformats.org/officeDocument/2006/relationships" xmlns:m="http://schemas.openxmlformats.org/officeDocument/2006/math" xmlns:v="urn:schemas-microsoft-com:vml" xmlns:wp14="http://schemas.microsoft.com/office/word/2010/wordprocessingDrawing" xmlns:wp="http://schemas.openxmlformats.org/drawingml/2006/wordprocessingDrawing" xmlns:w10="urn:schemas-microsoft-com:office:word" xmlns:w="http://schemas.openxmlformats.org/wordprocessingml/2006/main" xmlns:w14="http://schemas.microsoft.com/office/word/2010/wordml" xmlns:w15="http://schemas.microsoft.com/office/word/2012/wordml" xmlns:wpg="http://schemas.microsoft.com/office/word/2010/wordprocessingGroup" xmlns:wpi="http://schemas.microsoft.com/office/word/2010/wordprocessingInk" xmlns:wne="http://schemas.microsoft.com/office/word/2006/wordml" xmlns:wps="http://schemas.microsoft.com/office/word/2010/wordprocessingShape" mc:Ignorable="w14 w15 wp14">
+<w:numbering xmlns:wpc="http://schemas.microsoft.com/office/word/2010/wordprocessingCanvas" xmlns:cx="http://schemas.microsoft.com/office/drawing/2014/chartex" xmlns:cx1="http://schemas.microsoft.com/office/drawing/2015/9/8/chartex" xmlns:cx2="http://schemas.microsoft.com/office/drawing/2015/10/21/chartex" xmlns:cx3="http://schemas.microsoft.com/office/drawing/2016/5/9/chartex" xmlns:cx4="http://schemas.microsoft.com/office/drawing/2016/5/10/chartex" xmlns:cx5="http://schemas.microsoft.com/office/drawing/2016/5/11/chartex" xmlns:cx6="http://schemas.microsoft.com/office/drawing/2016/5/12/chartex" xmlns:cx7="http://schemas.microsoft.com/office/drawing/2016/5/13/chartex" xmlns:cx8="http://schemas.microsoft.com/office/drawing/2016/5/14/chartex" xmlns:mc="http://schemas.openxmlformats.org/markup-compatibility/2006" xmlns:aink="http://schemas.microsoft.com/office/drawing/2016/ink" xmlns:am3d="http://schemas.microsoft.com/office/drawing/2017/model3d" xmlns:o="urn:schemas-microsoft-com:office:office" xmlns:oel="http://schemas.microsoft.com/office/2019/extlst" xmlns:r="http://schemas.openxmlformats.org/officeDocument/2006/relationships" xmlns:m="http://schemas.openxmlformats.org/officeDocument/2006/math" xmlns:v="urn:schemas-microsoft-com:vml" xmlns:wp14="http://schemas.microsoft.com/office/word/2010/wordprocessingDrawing" xmlns:wp="http://schemas.openxmlformats.org/drawingml/2006/wordprocessingDrawing" xmlns:w10="urn:schemas-microsoft-com:office:word" xmlns:w="http://schemas.openxmlformats.org/wordprocessingml/2006/main" xmlns:w14="http://schemas.microsoft.com/office/word/2010/wordml" xmlns:w15="http://schemas.microsoft.com/office/word/2012/wordml" xmlns:w16cex="http://schemas.microsoft.com/office/word/2018/wordml/cex" xmlns:w16cid="http://schemas.microsoft.com/office/word/2016/wordml/cid" xmlns:w16="http://schemas.microsoft.com/office/word/2018/wordml" xmlns:w16sdtdh="http://schemas.microsoft.com/office/word/2020/wordml/sdtdatahash" xmlns:w16se="http://schemas.microsoft.com/office/word/2015/wordml/symex" xmlns:wpg="http://schemas.microsoft.com/office/word/2010/wordprocessingGroup" xmlns:wpi="http://schemas.microsoft.com/office/word/2010/wordprocessingInk" xmlns:wne="http://schemas.microsoft.com/office/word/2006/wordml" xmlns:wps="http://schemas.microsoft.com/office/word/2010/wordprocessingShape" mc:Ignorable="w14 w15 w16se w16cid w16 w16cex w16sdtdh wp14">
+  <w:abstractNum w:abstractNumId="0" w15:restartNumberingAfterBreak="0">
+    <w:nsid w:val="184424C4"/>
+    <w:multiLevelType w:val="hybridMultilevel"/>
+    <w:tmpl w:val="511E852E"/>
+    <w:lvl w:ilvl="0" w:tplc="D7883352">
+      <w:start w:val="1"/>
+      <w:numFmt w:val="decimal"/>
+      <w:lvlText w:val="%1."/>
+      <w:lvlJc w:val="left"/>
+      <w:pPr>
+        <w:ind w:left="504" w:hanging="431"/>
+      </w:pPr>
+    </w:lvl>
+    <w:lvl w:ilvl="1" w:tplc="1F30D902">
+      <w:numFmt w:val="decimal"/>
+      <w:lvlText w:val=""/>
+      <w:lvlJc w:val="left"/>
+    </w:lvl>
+    <w:lvl w:ilvl="2" w:tplc="A264866E">
+      <w:numFmt w:val="decimal"/>
+      <w:lvlText w:val=""/>
+      <w:lvlJc w:val="left"/>
+    </w:lvl>
+    <w:lvl w:ilvl="3" w:tplc="AA6C8AD8">
+      <w:numFmt w:val="decimal"/>
+      <w:lvlText w:val=""/>
+      <w:lvlJc w:val="left"/>
+    </w:lvl>
+    <w:lvl w:ilvl="4" w:tplc="27CC0B42">
+      <w:numFmt w:val="decimal"/>
+      <w:lvlText w:val=""/>
+      <w:lvlJc w:val="left"/>
+    </w:lvl>
+    <w:lvl w:ilvl="5" w:tplc="20804472">
+      <w:numFmt w:val="decimal"/>
+      <w:lvlText w:val=""/>
+      <w:lvlJc w:val="left"/>
+    </w:lvl>
+    <w:lvl w:ilvl="6" w:tplc="545EFFD4">
+      <w:numFmt w:val="decimal"/>
+      <w:lvlText w:val=""/>
+      <w:lvlJc w:val="left"/>
+    </w:lvl>
+    <w:lvl w:ilvl="7" w:tplc="2E862B32">
+      <w:numFmt w:val="decimal"/>
+      <w:lvlText w:val=""/>
+      <w:lvlJc w:val="left"/>
+    </w:lvl>
+    <w:lvl w:ilvl="8" w:tplc="789C95E4">
+      <w:numFmt w:val="decimal"/>
+      <w:lvlText w:val=""/>
+      <w:lvlJc w:val="left"/>
+    </w:lvl>
+  </w:abstractNum>
   <w:abstractNum w:abstractNumId="1" w15:restartNumberingAfterBreak="0">
+    <w:nsid w:val="32103AC0"/>
     <w:multiLevelType w:val="hybridMultilevel"/>
-    <w:lvl w:ilvl="0" w15:tentative="1">
+    <w:tmpl w:val="3A4855C2"/>
+    <w:lvl w:ilvl="0" w:tplc="60B207B0">
       <w:start w:val="1"/>
       <w:numFmt w:val="bullet"/>
       <w:lvlText w:val="●"/>
@@ -741,7 +683,7 @@
         <w:ind w:left="720" w:hanging="360"/>
       </w:pPr>
     </w:lvl>
-    <w:lvl w:ilvl="1" w15:tentative="1">
+    <w:lvl w:ilvl="1" w:tplc="40E88A2E">
       <w:start w:val="1"/>
       <w:numFmt w:val="bullet"/>
       <w:lvlText w:val="○"/>
@@ -750,7 +692,7 @@
         <w:ind w:left="1440" w:hanging="360"/>
       </w:pPr>
     </w:lvl>
-    <w:lvl w:ilvl="2" w15:tentative="1">
+    <w:lvl w:ilvl="2" w:tplc="AE9068F6">
       <w:start w:val="1"/>
       <w:numFmt w:val="bullet"/>
       <w:lvlText w:val="■"/>
@@ -759,7 +701,7 @@
         <w:ind w:left="2160" w:hanging="360"/>
       </w:pPr>
     </w:lvl>
-    <w:lvl w:ilvl="3" w15:tentative="1">
+    <w:lvl w:ilvl="3" w:tplc="034CEFCE">
       <w:start w:val="1"/>
       <w:numFmt w:val="bullet"/>
       <w:lvlText w:val="●"/>
@@ -768,7 +710,7 @@
         <w:ind w:left="2880" w:hanging="360"/>
       </w:pPr>
     </w:lvl>
-    <w:lvl w:ilvl="4" w15:tentative="1">
+    <w:lvl w:ilvl="4" w:tplc="6054F0FE">
       <w:start w:val="1"/>
       <w:numFmt w:val="bullet"/>
       <w:lvlText w:val="○"/>
@@ -777,7 +719,7 @@
         <w:ind w:left="3600" w:hanging="360"/>
       </w:pPr>
     </w:lvl>
-    <w:lvl w:ilvl="5" w15:tentative="1">
+    <w:lvl w:ilvl="5" w:tplc="FF18C838">
       <w:start w:val="1"/>
       <w:numFmt w:val="bullet"/>
       <w:lvlText w:val="■"/>
@@ -786,7 +728,7 @@
         <w:ind w:left="4320" w:hanging="360"/>
       </w:pPr>
     </w:lvl>
-    <w:lvl w:ilvl="6" w15:tentative="1">
+    <w:lvl w:ilvl="6" w:tplc="85B4E596">
       <w:start w:val="1"/>
       <w:numFmt w:val="bullet"/>
       <w:lvlText w:val="●"/>
@@ -795,7 +737,7 @@
         <w:ind w:left="5040" w:hanging="360"/>
       </w:pPr>
     </w:lvl>
-    <w:lvl w:ilvl="7" w15:tentative="1">
+    <w:lvl w:ilvl="7" w:tplc="67746A96">
       <w:start w:val="1"/>
       <w:numFmt w:val="bullet"/>
       <w:lvlText w:val="●"/>
@@ -804,7 +746,7 @@
         <w:ind w:left="5760" w:hanging="360"/>
       </w:pPr>
     </w:lvl>
-    <w:lvl w:ilvl="8" w15:tentative="1">
+    <w:lvl w:ilvl="8" w:tplc="98F81276">
       <w:start w:val="1"/>
       <w:numFmt w:val="bullet"/>
       <w:lvlText w:val="●"/>
@@ -815,8 +757,10 @@
     </w:lvl>
   </w:abstractNum>
   <w:abstractNum w:abstractNumId="2" w15:restartNumberingAfterBreak="0">
+    <w:nsid w:val="3C596810"/>
     <w:multiLevelType w:val="hybridMultilevel"/>
-    <w:lvl w:ilvl="0" w15:tentative="1">
+    <w:tmpl w:val="0F8E1B74"/>
+    <w:lvl w:ilvl="0" w:tplc="85904818">
       <w:start w:val="1"/>
       <w:numFmt w:val="decimal"/>
       <w:lvlText w:val="%1."/>
@@ -824,11 +768,53 @@
       <w:pPr>
         <w:ind w:left="504" w:hanging="431"/>
       </w:pPr>
+    </w:lvl>
+    <w:lvl w:ilvl="1" w:tplc="151E799A">
+      <w:numFmt w:val="decimal"/>
+      <w:lvlText w:val=""/>
+      <w:lvlJc w:val="left"/>
+    </w:lvl>
+    <w:lvl w:ilvl="2" w:tplc="677C639A">
+      <w:numFmt w:val="decimal"/>
+      <w:lvlText w:val=""/>
+      <w:lvlJc w:val="left"/>
+    </w:lvl>
+    <w:lvl w:ilvl="3" w:tplc="77CADFF4">
+      <w:numFmt w:val="decimal"/>
+      <w:lvlText w:val=""/>
+      <w:lvlJc w:val="left"/>
+    </w:lvl>
+    <w:lvl w:ilvl="4" w:tplc="2A14A65C">
+      <w:numFmt w:val="decimal"/>
+      <w:lvlText w:val=""/>
+      <w:lvlJc w:val="left"/>
+    </w:lvl>
+    <w:lvl w:ilvl="5" w:tplc="81E0F6D0">
+      <w:numFmt w:val="decimal"/>
+      <w:lvlText w:val=""/>
+      <w:lvlJc w:val="left"/>
+    </w:lvl>
+    <w:lvl w:ilvl="6" w:tplc="0BB0D928">
+      <w:numFmt w:val="decimal"/>
+      <w:lvlText w:val=""/>
+      <w:lvlJc w:val="left"/>
+    </w:lvl>
+    <w:lvl w:ilvl="7" w:tplc="6CFA563A">
+      <w:numFmt w:val="decimal"/>
+      <w:lvlText w:val=""/>
+      <w:lvlJc w:val="left"/>
+    </w:lvl>
+    <w:lvl w:ilvl="8" w:tplc="73A872C4">
+      <w:numFmt w:val="decimal"/>
+      <w:lvlText w:val=""/>
+      <w:lvlJc w:val="left"/>
     </w:lvl>
   </w:abstractNum>
   <w:abstractNum w:abstractNumId="3" w15:restartNumberingAfterBreak="0">
+    <w:nsid w:val="448D19C8"/>
     <w:multiLevelType w:val="hybridMultilevel"/>
-    <w:lvl w:ilvl="0" w15:tentative="1">
+    <w:tmpl w:val="8CE80448"/>
+    <w:lvl w:ilvl="0" w:tplc="9AB0D6BA">
       <w:start w:val="1"/>
       <w:numFmt w:val="decimal"/>
       <w:lvlText w:val="%1."/>
@@ -836,11 +822,53 @@
       <w:pPr>
         <w:ind w:left="504" w:hanging="431"/>
       </w:pPr>
+    </w:lvl>
+    <w:lvl w:ilvl="1" w:tplc="5D82AA70">
+      <w:numFmt w:val="decimal"/>
+      <w:lvlText w:val=""/>
+      <w:lvlJc w:val="left"/>
+    </w:lvl>
+    <w:lvl w:ilvl="2" w:tplc="242C17A2">
+      <w:numFmt w:val="decimal"/>
+      <w:lvlText w:val=""/>
+      <w:lvlJc w:val="left"/>
+    </w:lvl>
+    <w:lvl w:ilvl="3" w:tplc="0994BDEE">
+      <w:numFmt w:val="decimal"/>
+      <w:lvlText w:val=""/>
+      <w:lvlJc w:val="left"/>
+    </w:lvl>
+    <w:lvl w:ilvl="4" w:tplc="D5A48072">
+      <w:numFmt w:val="decimal"/>
+      <w:lvlText w:val=""/>
+      <w:lvlJc w:val="left"/>
+    </w:lvl>
+    <w:lvl w:ilvl="5" w:tplc="1D4C7304">
+      <w:numFmt w:val="decimal"/>
+      <w:lvlText w:val=""/>
+      <w:lvlJc w:val="left"/>
+    </w:lvl>
+    <w:lvl w:ilvl="6" w:tplc="D6CA8908">
+      <w:numFmt w:val="decimal"/>
+      <w:lvlText w:val=""/>
+      <w:lvlJc w:val="left"/>
+    </w:lvl>
+    <w:lvl w:ilvl="7" w:tplc="894A4010">
+      <w:numFmt w:val="decimal"/>
+      <w:lvlText w:val=""/>
+      <w:lvlJc w:val="left"/>
+    </w:lvl>
+    <w:lvl w:ilvl="8" w:tplc="2C3C5712">
+      <w:numFmt w:val="decimal"/>
+      <w:lvlText w:val=""/>
+      <w:lvlJc w:val="left"/>
     </w:lvl>
   </w:abstractNum>
   <w:abstractNum w:abstractNumId="4" w15:restartNumberingAfterBreak="0">
+    <w:nsid w:val="4CE1100B"/>
     <w:multiLevelType w:val="hybridMultilevel"/>
-    <w:lvl w:ilvl="0" w15:tentative="1">
+    <w:tmpl w:val="75386F6E"/>
+    <w:lvl w:ilvl="0" w:tplc="2C10D432">
       <w:start w:val="1"/>
       <w:numFmt w:val="decimal"/>
       <w:lvlText w:val="%1."/>
@@ -848,11 +876,53 @@
       <w:pPr>
         <w:ind w:left="504" w:hanging="431"/>
       </w:pPr>
+    </w:lvl>
+    <w:lvl w:ilvl="1" w:tplc="1554B984">
+      <w:numFmt w:val="decimal"/>
+      <w:lvlText w:val=""/>
+      <w:lvlJc w:val="left"/>
+    </w:lvl>
+    <w:lvl w:ilvl="2" w:tplc="B7527516">
+      <w:numFmt w:val="decimal"/>
+      <w:lvlText w:val=""/>
+      <w:lvlJc w:val="left"/>
+    </w:lvl>
+    <w:lvl w:ilvl="3" w:tplc="6D98CA0C">
+      <w:numFmt w:val="decimal"/>
+      <w:lvlText w:val=""/>
+      <w:lvlJc w:val="left"/>
+    </w:lvl>
+    <w:lvl w:ilvl="4" w:tplc="B57863E2">
+      <w:numFmt w:val="decimal"/>
+      <w:lvlText w:val=""/>
+      <w:lvlJc w:val="left"/>
+    </w:lvl>
+    <w:lvl w:ilvl="5" w:tplc="727800F0">
+      <w:numFmt w:val="decimal"/>
+      <w:lvlText w:val=""/>
+      <w:lvlJc w:val="left"/>
+    </w:lvl>
+    <w:lvl w:ilvl="6" w:tplc="2D9E5DA6">
+      <w:numFmt w:val="decimal"/>
+      <w:lvlText w:val=""/>
+      <w:lvlJc w:val="left"/>
+    </w:lvl>
+    <w:lvl w:ilvl="7" w:tplc="2C26F9A2">
+      <w:numFmt w:val="decimal"/>
+      <w:lvlText w:val=""/>
+      <w:lvlJc w:val="left"/>
+    </w:lvl>
+    <w:lvl w:ilvl="8" w:tplc="5A40BF7E">
+      <w:numFmt w:val="decimal"/>
+      <w:lvlText w:val=""/>
+      <w:lvlJc w:val="left"/>
     </w:lvl>
   </w:abstractNum>
   <w:abstractNum w:abstractNumId="5" w15:restartNumberingAfterBreak="0">
+    <w:nsid w:val="57EF2EBA"/>
     <w:multiLevelType w:val="hybridMultilevel"/>
-    <w:lvl w:ilvl="0" w15:tentative="1">
+    <w:tmpl w:val="A6384508"/>
+    <w:lvl w:ilvl="0" w:tplc="CDCEFDBA">
       <w:start w:val="1"/>
       <w:numFmt w:val="decimal"/>
       <w:lvlText w:val="%1."/>
@@ -860,11 +930,53 @@
       <w:pPr>
         <w:ind w:left="504" w:hanging="431"/>
       </w:pPr>
+    </w:lvl>
+    <w:lvl w:ilvl="1" w:tplc="5A862568">
+      <w:numFmt w:val="decimal"/>
+      <w:lvlText w:val=""/>
+      <w:lvlJc w:val="left"/>
+    </w:lvl>
+    <w:lvl w:ilvl="2" w:tplc="8D346A58">
+      <w:numFmt w:val="decimal"/>
+      <w:lvlText w:val=""/>
+      <w:lvlJc w:val="left"/>
+    </w:lvl>
+    <w:lvl w:ilvl="3" w:tplc="43884474">
+      <w:numFmt w:val="decimal"/>
+      <w:lvlText w:val=""/>
+      <w:lvlJc w:val="left"/>
+    </w:lvl>
+    <w:lvl w:ilvl="4" w:tplc="8BB4FC06">
+      <w:numFmt w:val="decimal"/>
+      <w:lvlText w:val=""/>
+      <w:lvlJc w:val="left"/>
+    </w:lvl>
+    <w:lvl w:ilvl="5" w:tplc="2D48AD22">
+      <w:numFmt w:val="decimal"/>
+      <w:lvlText w:val=""/>
+      <w:lvlJc w:val="left"/>
+    </w:lvl>
+    <w:lvl w:ilvl="6" w:tplc="87DC91E2">
+      <w:numFmt w:val="decimal"/>
+      <w:lvlText w:val=""/>
+      <w:lvlJc w:val="left"/>
+    </w:lvl>
+    <w:lvl w:ilvl="7" w:tplc="30F453C2">
+      <w:numFmt w:val="decimal"/>
+      <w:lvlText w:val=""/>
+      <w:lvlJc w:val="left"/>
+    </w:lvl>
+    <w:lvl w:ilvl="8" w:tplc="A5206A86">
+      <w:numFmt w:val="decimal"/>
+      <w:lvlText w:val=""/>
+      <w:lvlJc w:val="left"/>
     </w:lvl>
   </w:abstractNum>
   <w:abstractNum w:abstractNumId="6" w15:restartNumberingAfterBreak="0">
+    <w:nsid w:val="63FE42EC"/>
     <w:multiLevelType w:val="hybridMultilevel"/>
-    <w:lvl w:ilvl="0" w15:tentative="1">
+    <w:tmpl w:val="1E2CF9C8"/>
+    <w:lvl w:ilvl="0" w:tplc="3072E910">
       <w:start w:val="1"/>
       <w:numFmt w:val="decimal"/>
       <w:lvlText w:val="%1."/>
@@ -872,11 +984,53 @@
       <w:pPr>
         <w:ind w:left="504" w:hanging="431"/>
       </w:pPr>
+    </w:lvl>
+    <w:lvl w:ilvl="1" w:tplc="A000C31E">
+      <w:numFmt w:val="decimal"/>
+      <w:lvlText w:val=""/>
+      <w:lvlJc w:val="left"/>
+    </w:lvl>
+    <w:lvl w:ilvl="2" w:tplc="E7D4337A">
+      <w:numFmt w:val="decimal"/>
+      <w:lvlText w:val=""/>
+      <w:lvlJc w:val="left"/>
+    </w:lvl>
+    <w:lvl w:ilvl="3" w:tplc="5D8AD95C">
+      <w:numFmt w:val="decimal"/>
+      <w:lvlText w:val=""/>
+      <w:lvlJc w:val="left"/>
+    </w:lvl>
+    <w:lvl w:ilvl="4" w:tplc="3D8C8FF2">
+      <w:numFmt w:val="decimal"/>
+      <w:lvlText w:val=""/>
+      <w:lvlJc w:val="left"/>
+    </w:lvl>
+    <w:lvl w:ilvl="5" w:tplc="ADBC8A5C">
+      <w:numFmt w:val="decimal"/>
+      <w:lvlText w:val=""/>
+      <w:lvlJc w:val="left"/>
+    </w:lvl>
+    <w:lvl w:ilvl="6" w:tplc="602606C4">
+      <w:numFmt w:val="decimal"/>
+      <w:lvlText w:val=""/>
+      <w:lvlJc w:val="left"/>
+    </w:lvl>
+    <w:lvl w:ilvl="7" w:tplc="E94CAA18">
+      <w:numFmt w:val="decimal"/>
+      <w:lvlText w:val=""/>
+      <w:lvlJc w:val="left"/>
+    </w:lvl>
+    <w:lvl w:ilvl="8" w:tplc="F5149A42">
+      <w:numFmt w:val="decimal"/>
+      <w:lvlText w:val=""/>
+      <w:lvlJc w:val="left"/>
     </w:lvl>
   </w:abstractNum>
   <w:abstractNum w:abstractNumId="7" w15:restartNumberingAfterBreak="0">
+    <w:nsid w:val="68DD3E27"/>
     <w:multiLevelType w:val="hybridMultilevel"/>
-    <w:lvl w:ilvl="0" w15:tentative="1">
+    <w:tmpl w:val="59D81AB6"/>
+    <w:lvl w:ilvl="0" w:tplc="267A9632">
       <w:start w:val="1"/>
       <w:numFmt w:val="decimal"/>
       <w:lvlText w:val="%1."/>
@@ -884,11 +1038,53 @@
       <w:pPr>
         <w:ind w:left="504" w:hanging="431"/>
       </w:pPr>
+    </w:lvl>
+    <w:lvl w:ilvl="1" w:tplc="96D6F7D4">
+      <w:numFmt w:val="decimal"/>
+      <w:lvlText w:val=""/>
+      <w:lvlJc w:val="left"/>
+    </w:lvl>
+    <w:lvl w:ilvl="2" w:tplc="3C6C483C">
+      <w:numFmt w:val="decimal"/>
+      <w:lvlText w:val=""/>
+      <w:lvlJc w:val="left"/>
+    </w:lvl>
+    <w:lvl w:ilvl="3" w:tplc="BCC08498">
+      <w:numFmt w:val="decimal"/>
+      <w:lvlText w:val=""/>
+      <w:lvlJc w:val="left"/>
+    </w:lvl>
+    <w:lvl w:ilvl="4" w:tplc="3AC60EA4">
+      <w:numFmt w:val="decimal"/>
+      <w:lvlText w:val=""/>
+      <w:lvlJc w:val="left"/>
+    </w:lvl>
+    <w:lvl w:ilvl="5" w:tplc="1F74E9AC">
+      <w:numFmt w:val="decimal"/>
+      <w:lvlText w:val=""/>
+      <w:lvlJc w:val="left"/>
+    </w:lvl>
+    <w:lvl w:ilvl="6" w:tplc="0A2EFDC0">
+      <w:numFmt w:val="decimal"/>
+      <w:lvlText w:val=""/>
+      <w:lvlJc w:val="left"/>
+    </w:lvl>
+    <w:lvl w:ilvl="7" w:tplc="639AA3E2">
+      <w:numFmt w:val="decimal"/>
+      <w:lvlText w:val=""/>
+      <w:lvlJc w:val="left"/>
+    </w:lvl>
+    <w:lvl w:ilvl="8" w:tplc="BBBEEBF2">
+      <w:numFmt w:val="decimal"/>
+      <w:lvlText w:val=""/>
+      <w:lvlJc w:val="left"/>
     </w:lvl>
   </w:abstractNum>
   <w:abstractNum w:abstractNumId="8" w15:restartNumberingAfterBreak="0">
+    <w:nsid w:val="768F2A87"/>
     <w:multiLevelType w:val="hybridMultilevel"/>
-    <w:lvl w:ilvl="0" w15:tentative="1">
+    <w:tmpl w:val="52309696"/>
+    <w:lvl w:ilvl="0" w:tplc="7FC4E946">
       <w:start w:val="1"/>
       <w:numFmt w:val="decimal"/>
       <w:lvlText w:val="%1."/>
@@ -897,69 +1093,97 @@
         <w:ind w:left="504" w:hanging="431"/>
       </w:pPr>
     </w:lvl>
+    <w:lvl w:ilvl="1" w:tplc="C574890C">
+      <w:numFmt w:val="decimal"/>
+      <w:lvlText w:val=""/>
+      <w:lvlJc w:val="left"/>
+    </w:lvl>
+    <w:lvl w:ilvl="2" w:tplc="316C6042">
+      <w:numFmt w:val="decimal"/>
+      <w:lvlText w:val=""/>
+      <w:lvlJc w:val="left"/>
+    </w:lvl>
+    <w:lvl w:ilvl="3" w:tplc="35F0B0B4">
+      <w:numFmt w:val="decimal"/>
+      <w:lvlText w:val=""/>
+      <w:lvlJc w:val="left"/>
+    </w:lvl>
+    <w:lvl w:ilvl="4" w:tplc="79121064">
+      <w:numFmt w:val="decimal"/>
+      <w:lvlText w:val=""/>
+      <w:lvlJc w:val="left"/>
+    </w:lvl>
+    <w:lvl w:ilvl="5" w:tplc="2F38FD32">
+      <w:numFmt w:val="decimal"/>
+      <w:lvlText w:val=""/>
+      <w:lvlJc w:val="left"/>
+    </w:lvl>
+    <w:lvl w:ilvl="6" w:tplc="2852434E">
+      <w:numFmt w:val="decimal"/>
+      <w:lvlText w:val=""/>
+      <w:lvlJc w:val="left"/>
+    </w:lvl>
+    <w:lvl w:ilvl="7" w:tplc="96781C4C">
+      <w:numFmt w:val="decimal"/>
+      <w:lvlText w:val=""/>
+      <w:lvlJc w:val="left"/>
+    </w:lvl>
+    <w:lvl w:ilvl="8" w:tplc="E0B8AAEC">
+      <w:numFmt w:val="decimal"/>
+      <w:lvlText w:val=""/>
+      <w:lvlJc w:val="left"/>
+    </w:lvl>
   </w:abstractNum>
-  <w:abstractNum w:abstractNumId="9" w15:restartNumberingAfterBreak="0">
-    <w:multiLevelType w:val="hybridMultilevel"/>
-    <w:lvl w:ilvl="0" w15:tentative="1">
-      <w:start w:val="1"/>
-      <w:numFmt w:val="decimal"/>
-      <w:lvlText w:val="%1."/>
-      <w:lvlJc w:val="left"/>
-      <w:pPr>
-        <w:ind w:left="504" w:hanging="431"/>
-      </w:pPr>
-    </w:lvl>
-  </w:abstractNum>
-  <w:num w:numId="1">
+  <w:num w:numId="1" w16cid:durableId="900095959">
     <w:abstractNumId w:val="1"/>
     <w:lvlOverride w:ilvl="0">
       <w:startOverride w:val="1"/>
     </w:lvlOverride>
   </w:num>
-  <w:num w:numId="2">
+  <w:num w:numId="2" w16cid:durableId="965161538">
+    <w:abstractNumId w:val="6"/>
+    <w:lvlOverride w:ilvl="0">
+      <w:startOverride w:val="1"/>
+    </w:lvlOverride>
+  </w:num>
+  <w:num w:numId="3" w16cid:durableId="1204094821">
+    <w:abstractNumId w:val="0"/>
+    <w:lvlOverride w:ilvl="0">
+      <w:startOverride w:val="1"/>
+    </w:lvlOverride>
+  </w:num>
+  <w:num w:numId="4" w16cid:durableId="1801806579">
     <w:abstractNumId w:val="2"/>
     <w:lvlOverride w:ilvl="0">
       <w:startOverride w:val="1"/>
     </w:lvlOverride>
   </w:num>
-  <w:num w:numId="3">
-    <w:abstractNumId w:val="3"/>
+  <w:num w:numId="5" w16cid:durableId="577714748">
+    <w:abstractNumId w:val="8"/>
     <w:lvlOverride w:ilvl="0">
       <w:startOverride w:val="1"/>
     </w:lvlOverride>
   </w:num>
-  <w:num w:numId="4">
+  <w:num w:numId="6" w16cid:durableId="64761803">
+    <w:abstractNumId w:val="7"/>
+    <w:lvlOverride w:ilvl="0">
+      <w:startOverride w:val="1"/>
+    </w:lvlOverride>
+  </w:num>
+  <w:num w:numId="7" w16cid:durableId="1834756866">
     <w:abstractNumId w:val="4"/>
     <w:lvlOverride w:ilvl="0">
       <w:startOverride w:val="1"/>
     </w:lvlOverride>
   </w:num>
-  <w:num w:numId="5">
+  <w:num w:numId="8" w16cid:durableId="1652832255">
     <w:abstractNumId w:val="5"/>
     <w:lvlOverride w:ilvl="0">
       <w:startOverride w:val="1"/>
     </w:lvlOverride>
   </w:num>
-  <w:num w:numId="6">
-    <w:abstractNumId w:val="6"/>
-    <w:lvlOverride w:ilvl="0">
-      <w:startOverride w:val="1"/>
-    </w:lvlOverride>
-  </w:num>
-  <w:num w:numId="7">
-    <w:abstractNumId w:val="7"/>
-    <w:lvlOverride w:ilvl="0">
-      <w:startOverride w:val="1"/>
-    </w:lvlOverride>
-  </w:num>
-  <w:num w:numId="8">
-    <w:abstractNumId w:val="8"/>
-    <w:lvlOverride w:ilvl="0">
-      <w:startOverride w:val="1"/>
-    </w:lvlOverride>
-  </w:num>
-  <w:num w:numId="9">
-    <w:abstractNumId w:val="9"/>
+  <w:num w:numId="9" w16cid:durableId="1902596186">
+    <w:abstractNumId w:val="3"/>
     <w:lvlOverride w:ilvl="0">
       <w:startOverride w:val="1"/>
     </w:lvlOverride>
@@ -968,26 +1192,405 @@
 </file>
 
 <file path=word/styles.xml><?xml version="1.0" encoding="utf-8"?>
-<w:styles xmlns:mc="http://schemas.openxmlformats.org/markup-compatibility/2006" xmlns:r="http://schemas.openxmlformats.org/officeDocument/2006/relationships" xmlns:w="http://schemas.openxmlformats.org/wordprocessingml/2006/main" xmlns:w14="http://schemas.microsoft.com/office/word/2010/wordml" xmlns:w15="http://schemas.microsoft.com/office/word/2012/wordml" mc:Ignorable="w14 w15">
+<w:styles xmlns:mc="http://schemas.openxmlformats.org/markup-compatibility/2006" xmlns:r="http://schemas.openxmlformats.org/officeDocument/2006/relationships" xmlns:w="http://schemas.openxmlformats.org/wordprocessingml/2006/main" xmlns:w14="http://schemas.microsoft.com/office/word/2010/wordml" xmlns:w15="http://schemas.microsoft.com/office/word/2012/wordml" xmlns:w16cex="http://schemas.microsoft.com/office/word/2018/wordml/cex" xmlns:w16cid="http://schemas.microsoft.com/office/word/2016/wordml/cid" xmlns:w16="http://schemas.microsoft.com/office/word/2018/wordml" xmlns:w16sdtdh="http://schemas.microsoft.com/office/word/2020/wordml/sdtdatahash" xmlns:w16se="http://schemas.microsoft.com/office/word/2015/wordml/symex" mc:Ignorable="w14 w15 w16se w16cid w16 w16cex w16sdtdh">
   <w:docDefaults>
-    <w:rPrDefault/>
+    <w:rPrDefault>
+      <w:rPr>
+        <w:rFonts w:ascii="Times New Roman" w:eastAsia="Times New Roman" w:hAnsi="Times New Roman" w:cs="Times New Roman"/>
+        <w:lang w:val="en-US" w:eastAsia="en-US" w:bidi="ar-SA"/>
+      </w:rPr>
+    </w:rPrDefault>
     <w:pPrDefault/>
   </w:docDefaults>
-  <w:style w:type="paragraph" w:styleId="Title">
-    <w:name w:val="Title"/>
-    <w:basedOn w:val="Normal"/>
-    <w:next w:val="Normal"/>
+  <w:latentStyles w:defLockedState="0" w:defUIPriority="99" w:defSemiHidden="0" w:defUnhideWhenUsed="0" w:defQFormat="0" w:count="376">
+    <w:lsdException w:name="Normal" w:uiPriority="0" w:qFormat="1"/>
+    <w:lsdException w:name="heading 1" w:uiPriority="9" w:qFormat="1"/>
+    <w:lsdException w:name="heading 2" w:semiHidden="1" w:uiPriority="9" w:unhideWhenUsed="1" w:qFormat="1"/>
+    <w:lsdException w:name="heading 3" w:semiHidden="1" w:uiPriority="9" w:unhideWhenUsed="1" w:qFormat="1"/>
+    <w:lsdException w:name="heading 4" w:semiHidden="1" w:uiPriority="9" w:unhideWhenUsed="1" w:qFormat="1"/>
+    <w:lsdException w:name="heading 5" w:semiHidden="1" w:uiPriority="9" w:unhideWhenUsed="1" w:qFormat="1"/>
+    <w:lsdException w:name="heading 6" w:semiHidden="1" w:uiPriority="9" w:unhideWhenUsed="1" w:qFormat="1"/>
+    <w:lsdException w:name="heading 7" w:semiHidden="1" w:uiPriority="9" w:unhideWhenUsed="1" w:qFormat="1"/>
+    <w:lsdException w:name="heading 8" w:semiHidden="1" w:uiPriority="9" w:unhideWhenUsed="1" w:qFormat="1"/>
+    <w:lsdException w:name="heading 9" w:semiHidden="1" w:uiPriority="9" w:unhideWhenUsed="1" w:qFormat="1"/>
+    <w:lsdException w:name="index 1" w:semiHidden="1" w:unhideWhenUsed="1"/>
+    <w:lsdException w:name="index 2" w:semiHidden="1" w:unhideWhenUsed="1"/>
+    <w:lsdException w:name="index 3" w:semiHidden="1" w:unhideWhenUsed="1"/>
+    <w:lsdException w:name="index 4" w:semiHidden="1" w:unhideWhenUsed="1"/>
+    <w:lsdException w:name="index 5" w:semiHidden="1" w:unhideWhenUsed="1"/>
+    <w:lsdException w:name="index 6" w:semiHidden="1" w:unhideWhenUsed="1"/>
+    <w:lsdException w:name="index 7" w:semiHidden="1" w:unhideWhenUsed="1"/>
+    <w:lsdException w:name="index 8" w:semiHidden="1" w:unhideWhenUsed="1"/>
+    <w:lsdException w:name="index 9" w:semiHidden="1" w:unhideWhenUsed="1"/>
+    <w:lsdException w:name="toc 1" w:semiHidden="1" w:uiPriority="39" w:unhideWhenUsed="1"/>
+    <w:lsdException w:name="toc 2" w:semiHidden="1" w:uiPriority="39" w:unhideWhenUsed="1"/>
+    <w:lsdException w:name="toc 3" w:semiHidden="1" w:uiPriority="39" w:unhideWhenUsed="1"/>
+    <w:lsdException w:name="toc 4" w:semiHidden="1" w:uiPriority="39" w:unhideWhenUsed="1"/>
+    <w:lsdException w:name="toc 5" w:semiHidden="1" w:uiPriority="39" w:unhideWhenUsed="1"/>
+    <w:lsdException w:name="toc 6" w:semiHidden="1" w:uiPriority="39" w:unhideWhenUsed="1"/>
+    <w:lsdException w:name="toc 7" w:semiHidden="1" w:uiPriority="39" w:unhideWhenUsed="1"/>
+    <w:lsdException w:name="toc 8" w:semiHidden="1" w:uiPriority="39" w:unhideWhenUsed="1"/>
+    <w:lsdException w:name="toc 9" w:semiHidden="1" w:uiPriority="39" w:unhideWhenUsed="1"/>
+    <w:lsdException w:name="Normal Indent" w:semiHidden="1" w:unhideWhenUsed="1"/>
+    <w:lsdException w:name="footnote text" w:semiHidden="1" w:unhideWhenUsed="1"/>
+    <w:lsdException w:name="annotation text" w:semiHidden="1" w:unhideWhenUsed="1"/>
+    <w:lsdException w:name="header" w:semiHidden="1" w:unhideWhenUsed="1"/>
+    <w:lsdException w:name="footer" w:semiHidden="1" w:unhideWhenUsed="1"/>
+    <w:lsdException w:name="index heading" w:semiHidden="1" w:unhideWhenUsed="1"/>
+    <w:lsdException w:name="caption" w:semiHidden="1" w:uiPriority="35" w:unhideWhenUsed="1" w:qFormat="1"/>
+    <w:lsdException w:name="table of figures" w:semiHidden="1" w:unhideWhenUsed="1"/>
+    <w:lsdException w:name="envelope address" w:semiHidden="1" w:unhideWhenUsed="1"/>
+    <w:lsdException w:name="envelope return" w:semiHidden="1" w:unhideWhenUsed="1"/>
+    <w:lsdException w:name="footnote reference" w:semiHidden="1" w:unhideWhenUsed="1"/>
+    <w:lsdException w:name="annotation reference" w:semiHidden="1" w:unhideWhenUsed="1"/>
+    <w:lsdException w:name="line number" w:semiHidden="1" w:unhideWhenUsed="1"/>
+    <w:lsdException w:name="page number" w:semiHidden="1" w:unhideWhenUsed="1"/>
+    <w:lsdException w:name="endnote reference" w:semiHidden="1" w:unhideWhenUsed="1"/>
+    <w:lsdException w:name="endnote text" w:semiHidden="1" w:unhideWhenUsed="1"/>
+    <w:lsdException w:name="table of authorities" w:semiHidden="1" w:unhideWhenUsed="1"/>
+    <w:lsdException w:name="macro" w:semiHidden="1" w:unhideWhenUsed="1"/>
+    <w:lsdException w:name="toa heading" w:semiHidden="1" w:unhideWhenUsed="1"/>
+    <w:lsdException w:name="List" w:semiHidden="1" w:unhideWhenUsed="1"/>
+    <w:lsdException w:name="List Bullet" w:semiHidden="1" w:unhideWhenUsed="1"/>
+    <w:lsdException w:name="List Number" w:semiHidden="1" w:unhideWhenUsed="1"/>
+    <w:lsdException w:name="List 2" w:semiHidden="1" w:unhideWhenUsed="1"/>
+    <w:lsdException w:name="List 3" w:semiHidden="1" w:unhideWhenUsed="1"/>
+    <w:lsdException w:name="List 4" w:semiHidden="1" w:unhideWhenUsed="1"/>
+    <w:lsdException w:name="List 5" w:semiHidden="1" w:unhideWhenUsed="1"/>
+    <w:lsdException w:name="List Bullet 2" w:semiHidden="1" w:unhideWhenUsed="1"/>
+    <w:lsdException w:name="List Bullet 3" w:semiHidden="1" w:unhideWhenUsed="1"/>
+    <w:lsdException w:name="List Bullet 4" w:semiHidden="1" w:unhideWhenUsed="1"/>
+    <w:lsdException w:name="List Bullet 5" w:semiHidden="1" w:unhideWhenUsed="1"/>
+    <w:lsdException w:name="List Number 2" w:semiHidden="1" w:unhideWhenUsed="1"/>
+    <w:lsdException w:name="List Number 3" w:semiHidden="1" w:unhideWhenUsed="1"/>
+    <w:lsdException w:name="List Number 4" w:semiHidden="1" w:unhideWhenUsed="1"/>
+    <w:lsdException w:name="List Number 5" w:semiHidden="1" w:unhideWhenUsed="1"/>
+    <w:lsdException w:name="Title" w:uiPriority="10" w:qFormat="1"/>
+    <w:lsdException w:name="Closing" w:semiHidden="1" w:unhideWhenUsed="1"/>
+    <w:lsdException w:name="Signature" w:semiHidden="1" w:unhideWhenUsed="1"/>
+    <w:lsdException w:name="Default Paragraph Font" w:semiHidden="1" w:uiPriority="1" w:unhideWhenUsed="1"/>
+    <w:lsdException w:name="Body Text" w:semiHidden="1" w:unhideWhenUsed="1"/>
+    <w:lsdException w:name="Body Text Indent" w:semiHidden="1" w:unhideWhenUsed="1"/>
+    <w:lsdException w:name="List Continue" w:semiHidden="1" w:unhideWhenUsed="1"/>
+    <w:lsdException w:name="List Continue 2" w:semiHidden="1" w:unhideWhenUsed="1"/>
+    <w:lsdException w:name="List Continue 3" w:semiHidden="1" w:unhideWhenUsed="1"/>
+    <w:lsdException w:name="List Continue 4" w:semiHidden="1" w:unhideWhenUsed="1"/>
+    <w:lsdException w:name="List Continue 5" w:semiHidden="1" w:unhideWhenUsed="1"/>
+    <w:lsdException w:name="Message Header" w:semiHidden="1" w:unhideWhenUsed="1"/>
+    <w:lsdException w:name="Subtitle" w:uiPriority="11" w:qFormat="1"/>
+    <w:lsdException w:name="Salutation" w:semiHidden="1" w:unhideWhenUsed="1"/>
+    <w:lsdException w:name="Date" w:semiHidden="1" w:unhideWhenUsed="1"/>
+    <w:lsdException w:name="Body Text First Indent" w:semiHidden="1" w:unhideWhenUsed="1"/>
+    <w:lsdException w:name="Body Text First Indent 2" w:semiHidden="1" w:unhideWhenUsed="1"/>
+    <w:lsdException w:name="Note Heading" w:semiHidden="1" w:unhideWhenUsed="1"/>
+    <w:lsdException w:name="Body Text 2" w:semiHidden="1" w:unhideWhenUsed="1"/>
+    <w:lsdException w:name="Body Text 3" w:semiHidden="1" w:unhideWhenUsed="1"/>
+    <w:lsdException w:name="Body Text Indent 2" w:semiHidden="1" w:unhideWhenUsed="1"/>
+    <w:lsdException w:name="Body Text Indent 3" w:semiHidden="1" w:unhideWhenUsed="1"/>
+    <w:lsdException w:name="Block Text" w:semiHidden="1" w:unhideWhenUsed="1"/>
+    <w:lsdException w:name="Hyperlink" w:semiHidden="1" w:unhideWhenUsed="1"/>
+    <w:lsdException w:name="FollowedHyperlink" w:semiHidden="1" w:unhideWhenUsed="1"/>
+    <w:lsdException w:name="Strong" w:uiPriority="22" w:qFormat="1"/>
+    <w:lsdException w:name="Emphasis" w:uiPriority="20" w:qFormat="1"/>
+    <w:lsdException w:name="Document Map" w:semiHidden="1" w:unhideWhenUsed="1"/>
+    <w:lsdException w:name="Plain Text" w:semiHidden="1" w:unhideWhenUsed="1"/>
+    <w:lsdException w:name="E-mail Signature" w:semiHidden="1" w:unhideWhenUsed="1"/>
+    <w:lsdException w:name="HTML Top of Form" w:semiHidden="1" w:unhideWhenUsed="1"/>
+    <w:lsdException w:name="HTML Bottom of Form" w:semiHidden="1" w:unhideWhenUsed="1"/>
+    <w:lsdException w:name="Normal (Web)" w:semiHidden="1" w:unhideWhenUsed="1"/>
+    <w:lsdException w:name="HTML Acronym" w:semiHidden="1" w:unhideWhenUsed="1"/>
+    <w:lsdException w:name="HTML Address" w:semiHidden="1" w:unhideWhenUsed="1"/>
+    <w:lsdException w:name="HTML Cite" w:semiHidden="1" w:unhideWhenUsed="1"/>
+    <w:lsdException w:name="HTML Code" w:semiHidden="1" w:unhideWhenUsed="1"/>
+    <w:lsdException w:name="HTML Definition" w:semiHidden="1" w:unhideWhenUsed="1"/>
+    <w:lsdException w:name="HTML Keyboard" w:semiHidden="1" w:unhideWhenUsed="1"/>
+    <w:lsdException w:name="HTML Preformatted" w:semiHidden="1" w:unhideWhenUsed="1"/>
+    <w:lsdException w:name="HTML Sample" w:semiHidden="1" w:unhideWhenUsed="1"/>
+    <w:lsdException w:name="HTML Typewriter" w:semiHidden="1" w:unhideWhenUsed="1"/>
+    <w:lsdException w:name="HTML Variable" w:semiHidden="1" w:unhideWhenUsed="1"/>
+    <w:lsdException w:name="Normal Table" w:semiHidden="1" w:unhideWhenUsed="1"/>
+    <w:lsdException w:name="annotation subject" w:semiHidden="1" w:unhideWhenUsed="1"/>
+    <w:lsdException w:name="No List" w:semiHidden="1" w:unhideWhenUsed="1"/>
+    <w:lsdException w:name="Outline List 1" w:semiHidden="1" w:unhideWhenUsed="1"/>
+    <w:lsdException w:name="Outline List 2" w:semiHidden="1" w:unhideWhenUsed="1"/>
+    <w:lsdException w:name="Outline List 3" w:semiHidden="1" w:unhideWhenUsed="1"/>
+    <w:lsdException w:name="Table Simple 1" w:semiHidden="1" w:unhideWhenUsed="1"/>
+    <w:lsdException w:name="Table Simple 2" w:semiHidden="1" w:unhideWhenUsed="1"/>
+    <w:lsdException w:name="Table Simple 3" w:semiHidden="1" w:unhideWhenUsed="1"/>
+    <w:lsdException w:name="Table Classic 1" w:semiHidden="1" w:unhideWhenUsed="1"/>
+    <w:lsdException w:name="Table Classic 2" w:semiHidden="1" w:unhideWhenUsed="1"/>
+    <w:lsdException w:name="Table Classic 3" w:semiHidden="1" w:unhideWhenUsed="1"/>
+    <w:lsdException w:name="Table Classic 4" w:semiHidden="1" w:unhideWhenUsed="1"/>
+    <w:lsdException w:name="Table Colorful 1" w:semiHidden="1" w:unhideWhenUsed="1"/>
+    <w:lsdException w:name="Table Colorful 2" w:semiHidden="1" w:unhideWhenUsed="1"/>
+    <w:lsdException w:name="Table Colorful 3" w:semiHidden="1" w:unhideWhenUsed="1"/>
+    <w:lsdException w:name="Table Columns 1" w:semiHidden="1" w:unhideWhenUsed="1"/>
+    <w:lsdException w:name="Table Columns 2" w:semiHidden="1" w:unhideWhenUsed="1"/>
+    <w:lsdException w:name="Table Columns 3" w:semiHidden="1" w:unhideWhenUsed="1"/>
+    <w:lsdException w:name="Table Columns 4" w:semiHidden="1" w:unhideWhenUsed="1"/>
+    <w:lsdException w:name="Table Columns 5" w:semiHidden="1" w:unhideWhenUsed="1"/>
+    <w:lsdException w:name="Table Grid 1" w:semiHidden="1" w:unhideWhenUsed="1"/>
+    <w:lsdException w:name="Table Grid 2" w:semiHidden="1" w:unhideWhenUsed="1"/>
+    <w:lsdException w:name="Table Grid 3" w:semiHidden="1" w:unhideWhenUsed="1"/>
+    <w:lsdException w:name="Table Grid 4" w:semiHidden="1" w:unhideWhenUsed="1"/>
+    <w:lsdException w:name="Table Grid 5" w:semiHidden="1" w:unhideWhenUsed="1"/>
+    <w:lsdException w:name="Table Grid 6" w:semiHidden="1" w:unhideWhenUsed="1"/>
+    <w:lsdException w:name="Table Grid 7" w:semiHidden="1" w:unhideWhenUsed="1"/>
+    <w:lsdException w:name="Table Grid 8" w:semiHidden="1" w:unhideWhenUsed="1"/>
+    <w:lsdException w:name="Table List 1" w:semiHidden="1" w:unhideWhenUsed="1"/>
+    <w:lsdException w:name="Table List 2" w:semiHidden="1" w:unhideWhenUsed="1"/>
+    <w:lsdException w:name="Table List 3" w:semiHidden="1" w:unhideWhenUsed="1"/>
+    <w:lsdException w:name="Table List 4" w:semiHidden="1" w:unhideWhenUsed="1"/>
+    <w:lsdException w:name="Table List 5" w:semiHidden="1" w:unhideWhenUsed="1"/>
+    <w:lsdException w:name="Table List 6" w:semiHidden="1" w:unhideWhenUsed="1"/>
+    <w:lsdException w:name="Table List 7" w:semiHidden="1" w:unhideWhenUsed="1"/>
+    <w:lsdException w:name="Table List 8" w:semiHidden="1" w:unhideWhenUsed="1"/>
+    <w:lsdException w:name="Table 3D effects 1" w:semiHidden="1" w:unhideWhenUsed="1"/>
+    <w:lsdException w:name="Table 3D effects 2" w:semiHidden="1" w:unhideWhenUsed="1"/>
+    <w:lsdException w:name="Table 3D effects 3" w:semiHidden="1" w:unhideWhenUsed="1"/>
+    <w:lsdException w:name="Table Contemporary" w:semiHidden="1" w:unhideWhenUsed="1"/>
+    <w:lsdException w:name="Table Elegant" w:semiHidden="1" w:unhideWhenUsed="1"/>
+    <w:lsdException w:name="Table Professional" w:semiHidden="1" w:unhideWhenUsed="1"/>
+    <w:lsdException w:name="Table Subtle 1" w:semiHidden="1" w:unhideWhenUsed="1"/>
+    <w:lsdException w:name="Table Subtle 2" w:semiHidden="1" w:unhideWhenUsed="1"/>
+    <w:lsdException w:name="Table Web 1" w:semiHidden="1" w:unhideWhenUsed="1"/>
+    <w:lsdException w:name="Table Web 2" w:semiHidden="1" w:unhideWhenUsed="1"/>
+    <w:lsdException w:name="Table Web 3" w:semiHidden="1" w:unhideWhenUsed="1"/>
+    <w:lsdException w:name="Balloon Text" w:semiHidden="1" w:unhideWhenUsed="1"/>
+    <w:lsdException w:name="Table Grid" w:uiPriority="39"/>
+    <w:lsdException w:name="Table Theme" w:semiHidden="1" w:unhideWhenUsed="1"/>
+    <w:lsdException w:name="Placeholder Text" w:semiHidden="1"/>
+    <w:lsdException w:name="No Spacing" w:uiPriority="1" w:qFormat="1"/>
+    <w:lsdException w:name="Light Shading" w:uiPriority="60"/>
+    <w:lsdException w:name="Light List" w:uiPriority="61"/>
+    <w:lsdException w:name="Light Grid" w:uiPriority="62"/>
+    <w:lsdException w:name="Medium Shading 1" w:uiPriority="63"/>
+    <w:lsdException w:name="Medium Shading 2" w:uiPriority="64"/>
+    <w:lsdException w:name="Medium List 1" w:uiPriority="65"/>
+    <w:lsdException w:name="Medium List 2" w:uiPriority="66"/>
+    <w:lsdException w:name="Medium Grid 1" w:uiPriority="67"/>
+    <w:lsdException w:name="Medium Grid 2" w:uiPriority="68"/>
+    <w:lsdException w:name="Medium Grid 3" w:uiPriority="69"/>
+    <w:lsdException w:name="Dark List" w:uiPriority="70"/>
+    <w:lsdException w:name="Colorful Shading" w:uiPriority="71"/>
+    <w:lsdException w:name="Colorful List" w:uiPriority="72"/>
+    <w:lsdException w:name="Colorful Grid" w:uiPriority="73"/>
+    <w:lsdException w:name="Light Shading Accent 1" w:uiPriority="60"/>
+    <w:lsdException w:name="Light List Accent 1" w:uiPriority="61"/>
+    <w:lsdException w:name="Light Grid Accent 1" w:uiPriority="62"/>
+    <w:lsdException w:name="Medium Shading 1 Accent 1" w:uiPriority="63"/>
+    <w:lsdException w:name="Medium Shading 2 Accent 1" w:uiPriority="64"/>
+    <w:lsdException w:name="Medium List 1 Accent 1" w:uiPriority="65"/>
+    <w:lsdException w:name="Revision" w:semiHidden="1"/>
+    <w:lsdException w:name="List Paragraph" w:uiPriority="34" w:qFormat="1"/>
+    <w:lsdException w:name="Quote" w:uiPriority="29" w:qFormat="1"/>
+    <w:lsdException w:name="Intense Quote" w:uiPriority="30" w:qFormat="1"/>
+    <w:lsdException w:name="Medium List 2 Accent 1" w:uiPriority="66"/>
+    <w:lsdException w:name="Medium Grid 1 Accent 1" w:uiPriority="67"/>
+    <w:lsdException w:name="Medium Grid 2 Accent 1" w:uiPriority="68"/>
+    <w:lsdException w:name="Medium Grid 3 Accent 1" w:uiPriority="69"/>
+    <w:lsdException w:name="Dark List Accent 1" w:uiPriority="70"/>
+    <w:lsdException w:name="Colorful Shading Accent 1" w:uiPriority="71"/>
+    <w:lsdException w:name="Colorful List Accent 1" w:uiPriority="72"/>
+    <w:lsdException w:name="Colorful Grid Accent 1" w:uiPriority="73"/>
+    <w:lsdException w:name="Light Shading Accent 2" w:uiPriority="60"/>
+    <w:lsdException w:name="Light List Accent 2" w:uiPriority="61"/>
+    <w:lsdException w:name="Light Grid Accent 2" w:uiPriority="62"/>
+    <w:lsdException w:name="Medium Shading 1 Accent 2" w:uiPriority="63"/>
+    <w:lsdException w:name="Medium Shading 2 Accent 2" w:uiPriority="64"/>
+    <w:lsdException w:name="Medium List 1 Accent 2" w:uiPriority="65"/>
+    <w:lsdException w:name="Medium List 2 Accent 2" w:uiPriority="66"/>
+    <w:lsdException w:name="Medium Grid 1 Accent 2" w:uiPriority="67"/>
+    <w:lsdException w:name="Medium Grid 2 Accent 2" w:uiPriority="68"/>
+    <w:lsdException w:name="Medium Grid 3 Accent 2" w:uiPriority="69"/>
+    <w:lsdException w:name="Dark List Accent 2" w:uiPriority="70"/>
+    <w:lsdException w:name="Colorful Shading Accent 2" w:uiPriority="71"/>
+    <w:lsdException w:name="Colorful List Accent 2" w:uiPriority="72"/>
+    <w:lsdException w:name="Colorful Grid Accent 2" w:uiPriority="73"/>
+    <w:lsdException w:name="Light Shading Accent 3" w:uiPriority="60"/>
+    <w:lsdException w:name="Light List Accent 3" w:uiPriority="61"/>
+    <w:lsdException w:name="Light Grid Accent 3" w:uiPriority="62"/>
+    <w:lsdException w:name="Medium Shading 1 Accent 3" w:uiPriority="63"/>
+    <w:lsdException w:name="Medium Shading 2 Accent 3" w:uiPriority="64"/>
+    <w:lsdException w:name="Medium List 1 Accent 3" w:uiPriority="65"/>
+    <w:lsdException w:name="Medium List 2 Accent 3" w:uiPriority="66"/>
+    <w:lsdException w:name="Medium Grid 1 Accent 3" w:uiPriority="67"/>
+    <w:lsdException w:name="Medium Grid 2 Accent 3" w:uiPriority="68"/>
+    <w:lsdException w:name="Medium Grid 3 Accent 3" w:uiPriority="69"/>
+    <w:lsdException w:name="Dark List Accent 3" w:uiPriority="70"/>
+    <w:lsdException w:name="Colorful Shading Accent 3" w:uiPriority="71"/>
+    <w:lsdException w:name="Colorful List Accent 3" w:uiPriority="72"/>
+    <w:lsdException w:name="Colorful Grid Accent 3" w:uiPriority="73"/>
+    <w:lsdException w:name="Light Shading Accent 4" w:uiPriority="60"/>
+    <w:lsdException w:name="Light List Accent 4" w:uiPriority="61"/>
+    <w:lsdException w:name="Light Grid Accent 4" w:uiPriority="62"/>
+    <w:lsdException w:name="Medium Shading 1 Accent 4" w:uiPriority="63"/>
+    <w:lsdException w:name="Medium Shading 2 Accent 4" w:uiPriority="64"/>
+    <w:lsdException w:name="Medium List 1 Accent 4" w:uiPriority="65"/>
+    <w:lsdException w:name="Medium List 2 Accent 4" w:uiPriority="66"/>
+    <w:lsdException w:name="Medium Grid 1 Accent 4" w:uiPriority="67"/>
+    <w:lsdException w:name="Medium Grid 2 Accent 4" w:uiPriority="68"/>
+    <w:lsdException w:name="Medium Grid 3 Accent 4" w:uiPriority="69"/>
+    <w:lsdException w:name="Dark List Accent 4" w:uiPriority="70"/>
+    <w:lsdException w:name="Colorful Shading Accent 4" w:uiPriority="71"/>
+    <w:lsdException w:name="Colorful List Accent 4" w:uiPriority="72"/>
+    <w:lsdException w:name="Colorful Grid Accent 4" w:uiPriority="73"/>
+    <w:lsdException w:name="Light Shading Accent 5" w:uiPriority="60"/>
+    <w:lsdException w:name="Light List Accent 5" w:uiPriority="61"/>
+    <w:lsdException w:name="Light Grid Accent 5" w:uiPriority="62"/>
+    <w:lsdException w:name="Medium Shading 1 Accent 5" w:uiPriority="63"/>
+    <w:lsdException w:name="Medium Shading 2 Accent 5" w:uiPriority="64"/>
+    <w:lsdException w:name="Medium List 1 Accent 5" w:uiPriority="65"/>
+    <w:lsdException w:name="Medium List 2 Accent 5" w:uiPriority="66"/>
+    <w:lsdException w:name="Medium Grid 1 Accent 5" w:uiPriority="67"/>
+    <w:lsdException w:name="Medium Grid 2 Accent 5" w:uiPriority="68"/>
+    <w:lsdException w:name="Medium Grid 3 Accent 5" w:uiPriority="69"/>
+    <w:lsdException w:name="Dark List Accent 5" w:uiPriority="70"/>
+    <w:lsdException w:name="Colorful Shading Accent 5" w:uiPriority="71"/>
+    <w:lsdException w:name="Colorful List Accent 5" w:uiPriority="72"/>
+    <w:lsdException w:name="Colorful Grid Accent 5" w:uiPriority="73"/>
+    <w:lsdException w:name="Light Shading Accent 6" w:uiPriority="60"/>
+    <w:lsdException w:name="Light List Accent 6" w:uiPriority="61"/>
+    <w:lsdException w:name="Light Grid Accent 6" w:uiPriority="62"/>
+    <w:lsdException w:name="Medium Shading 1 Accent 6" w:uiPriority="63"/>
+    <w:lsdException w:name="Medium Shading 2 Accent 6" w:uiPriority="64"/>
+    <w:lsdException w:name="Medium List 1 Accent 6" w:uiPriority="65"/>
+    <w:lsdException w:name="Medium List 2 Accent 6" w:uiPriority="66"/>
+    <w:lsdException w:name="Medium Grid 1 Accent 6" w:uiPriority="67"/>
+    <w:lsdException w:name="Medium Grid 2 Accent 6" w:uiPriority="68"/>
+    <w:lsdException w:name="Medium Grid 3 Accent 6" w:uiPriority="69"/>
+    <w:lsdException w:name="Dark List Accent 6" w:uiPriority="70"/>
+    <w:lsdException w:name="Colorful Shading Accent 6" w:uiPriority="71"/>
+    <w:lsdException w:name="Colorful List Accent 6" w:uiPriority="72"/>
+    <w:lsdException w:name="Colorful Grid Accent 6" w:uiPriority="73"/>
+    <w:lsdException w:name="Subtle Emphasis" w:uiPriority="19" w:qFormat="1"/>
+    <w:lsdException w:name="Intense Emphasis" w:uiPriority="21" w:qFormat="1"/>
+    <w:lsdException w:name="Subtle Reference" w:uiPriority="31" w:qFormat="1"/>
+    <w:lsdException w:name="Intense Reference" w:uiPriority="32" w:qFormat="1"/>
+    <w:lsdException w:name="Book Title" w:uiPriority="33" w:qFormat="1"/>
+    <w:lsdException w:name="Bibliography" w:semiHidden="1" w:uiPriority="37" w:unhideWhenUsed="1"/>
+    <w:lsdException w:name="TOC Heading" w:semiHidden="1" w:uiPriority="39" w:unhideWhenUsed="1" w:qFormat="1"/>
+    <w:lsdException w:name="Plain Table 1" w:uiPriority="41"/>
+    <w:lsdException w:name="Plain Table 2" w:uiPriority="42"/>
+    <w:lsdException w:name="Plain Table 3" w:uiPriority="43"/>
+    <w:lsdException w:name="Plain Table 4" w:uiPriority="44"/>
+    <w:lsdException w:name="Plain Table 5" w:uiPriority="45"/>
+    <w:lsdException w:name="Grid Table Light" w:uiPriority="40"/>
+    <w:lsdException w:name="Grid Table 1 Light" w:uiPriority="46"/>
+    <w:lsdException w:name="Grid Table 2" w:uiPriority="47"/>
+    <w:lsdException w:name="Grid Table 3" w:uiPriority="48"/>
+    <w:lsdException w:name="Grid Table 4" w:uiPriority="49"/>
+    <w:lsdException w:name="Grid Table 5 Dark" w:uiPriority="50"/>
+    <w:lsdException w:name="Grid Table 6 Colorful" w:uiPriority="51"/>
+    <w:lsdException w:name="Grid Table 7 Colorful" w:uiPriority="52"/>
+    <w:lsdException w:name="Grid Table 1 Light Accent 1" w:uiPriority="46"/>
+    <w:lsdException w:name="Grid Table 2 Accent 1" w:uiPriority="47"/>
+    <w:lsdException w:name="Grid Table 3 Accent 1" w:uiPriority="48"/>
+    <w:lsdException w:name="Grid Table 4 Accent 1" w:uiPriority="49"/>
+    <w:lsdException w:name="Grid Table 5 Dark Accent 1" w:uiPriority="50"/>
+    <w:lsdException w:name="Grid Table 6 Colorful Accent 1" w:uiPriority="51"/>
+    <w:lsdException w:name="Grid Table 7 Colorful Accent 1" w:uiPriority="52"/>
+    <w:lsdException w:name="Grid Table 1 Light Accent 2" w:uiPriority="46"/>
+    <w:lsdException w:name="Grid Table 2 Accent 2" w:uiPriority="47"/>
+    <w:lsdException w:name="Grid Table 3 Accent 2" w:uiPriority="48"/>
+    <w:lsdException w:name="Grid Table 4 Accent 2" w:uiPriority="49"/>
+    <w:lsdException w:name="Grid Table 5 Dark Accent 2" w:uiPriority="50"/>
+    <w:lsdException w:name="Grid Table 6 Colorful Accent 2" w:uiPriority="51"/>
+    <w:lsdException w:name="Grid Table 7 Colorful Accent 2" w:uiPriority="52"/>
+    <w:lsdException w:name="Grid Table 1 Light Accent 3" w:uiPriority="46"/>
+    <w:lsdException w:name="Grid Table 2 Accent 3" w:uiPriority="47"/>
+    <w:lsdException w:name="Grid Table 3 Accent 3" w:uiPriority="48"/>
+    <w:lsdException w:name="Grid Table 4 Accent 3" w:uiPriority="49"/>
+    <w:lsdException w:name="Grid Table 5 Dark Accent 3" w:uiPriority="50"/>
+    <w:lsdException w:name="Grid Table 6 Colorful Accent 3" w:uiPriority="51"/>
+    <w:lsdException w:name="Grid Table 7 Colorful Accent 3" w:uiPriority="52"/>
+    <w:lsdException w:name="Grid Table 1 Light Accent 4" w:uiPriority="46"/>
+    <w:lsdException w:name="Grid Table 2 Accent 4" w:uiPriority="47"/>
+    <w:lsdException w:name="Grid Table 3 Accent 4" w:uiPriority="48"/>
+    <w:lsdException w:name="Grid Table 4 Accent 4" w:uiPriority="49"/>
+    <w:lsdException w:name="Grid Table 5 Dark Accent 4" w:uiPriority="50"/>
+    <w:lsdException w:name="Grid Table 6 Colorful Accent 4" w:uiPriority="51"/>
+    <w:lsdException w:name="Grid Table 7 Colorful Accent 4" w:uiPriority="52"/>
+    <w:lsdException w:name="Grid Table 1 Light Accent 5" w:uiPriority="46"/>
+    <w:lsdException w:name="Grid Table 2 Accent 5" w:uiPriority="47"/>
+    <w:lsdException w:name="Grid Table 3 Accent 5" w:uiPriority="48"/>
+    <w:lsdException w:name="Grid Table 4 Accent 5" w:uiPriority="49"/>
+    <w:lsdException w:name="Grid Table 5 Dark Accent 5" w:uiPriority="50"/>
+    <w:lsdException w:name="Grid Table 6 Colorful Accent 5" w:uiPriority="51"/>
+    <w:lsdException w:name="Grid Table 7 Colorful Accent 5" w:uiPriority="52"/>
+    <w:lsdException w:name="Grid Table 1 Light Accent 6" w:uiPriority="46"/>
+    <w:lsdException w:name="Grid Table 2 Accent 6" w:uiPriority="47"/>
+    <w:lsdException w:name="Grid Table 3 Accent 6" w:uiPriority="48"/>
+    <w:lsdException w:name="Grid Table 4 Accent 6" w:uiPriority="49"/>
+    <w:lsdException w:name="Grid Table 5 Dark Accent 6" w:uiPriority="50"/>
+    <w:lsdException w:name="Grid Table 6 Colorful Accent 6" w:uiPriority="51"/>
+    <w:lsdException w:name="Grid Table 7 Colorful Accent 6" w:uiPriority="52"/>
+    <w:lsdException w:name="List Table 1 Light" w:uiPriority="46"/>
+    <w:lsdException w:name="List Table 2" w:uiPriority="47"/>
+    <w:lsdException w:name="List Table 3" w:uiPriority="48"/>
+    <w:lsdException w:name="List Table 4" w:uiPriority="49"/>
+    <w:lsdException w:name="List Table 5 Dark" w:uiPriority="50"/>
+    <w:lsdException w:name="List Table 6 Colorful" w:uiPriority="51"/>
+    <w:lsdException w:name="List Table 7 Colorful" w:uiPriority="52"/>
+    <w:lsdException w:name="List Table 1 Light Accent 1" w:uiPriority="46"/>
+    <w:lsdException w:name="List Table 2 Accent 1" w:uiPriority="47"/>
+    <w:lsdException w:name="List Table 3 Accent 1" w:uiPriority="48"/>
+    <w:lsdException w:name="List Table 4 Accent 1" w:uiPriority="49"/>
+    <w:lsdException w:name="List Table 5 Dark Accent 1" w:uiPriority="50"/>
+    <w:lsdException w:name="List Table 6 Colorful Accent 1" w:uiPriority="51"/>
+    <w:lsdException w:name="List Table 7 Colorful Accent 1" w:uiPriority="52"/>
+    <w:lsdException w:name="List Table 1 Light Accent 2" w:uiPriority="46"/>
+    <w:lsdException w:name="List Table 2 Accent 2" w:uiPriority="47"/>
+    <w:lsdException w:name="List Table 3 Accent 2" w:uiPriority="48"/>
+    <w:lsdException w:name="List Table 4 Accent 2" w:uiPriority="49"/>
+    <w:lsdException w:name="List Table 5 Dark Accent 2" w:uiPriority="50"/>
+    <w:lsdException w:name="List Table 6 Colorful Accent 2" w:uiPriority="51"/>
+    <w:lsdException w:name="List Table 7 Colorful Accent 2" w:uiPriority="52"/>
+    <w:lsdException w:name="List Table 1 Light Accent 3" w:uiPriority="46"/>
+    <w:lsdException w:name="List Table 2 Accent 3" w:uiPriority="47"/>
+    <w:lsdException w:name="List Table 3 Accent 3" w:uiPriority="48"/>
+    <w:lsdException w:name="List Table 4 Accent 3" w:uiPriority="49"/>
+    <w:lsdException w:name="List Table 5 Dark Accent 3" w:uiPriority="50"/>
+    <w:lsdException w:name="List Table 6 Colorful Accent 3" w:uiPriority="51"/>
+    <w:lsdException w:name="List Table 7 Colorful Accent 3" w:uiPriority="52"/>
+    <w:lsdException w:name="List Table 1 Light Accent 4" w:uiPriority="46"/>
+    <w:lsdException w:name="List Table 2 Accent 4" w:uiPriority="47"/>
+    <w:lsdException w:name="List Table 3 Accent 4" w:uiPriority="48"/>
+    <w:lsdException w:name="List Table 4 Accent 4" w:uiPriority="49"/>
+    <w:lsdException w:name="List Table 5 Dark Accent 4" w:uiPriority="50"/>
+    <w:lsdException w:name="List Table 6 Colorful Accent 4" w:uiPriority="51"/>
+    <w:lsdException w:name="List Table 7 Colorful Accent 4" w:uiPriority="52"/>
+    <w:lsdException w:name="List Table 1 Light Accent 5" w:uiPriority="46"/>
+    <w:lsdException w:name="List Table 2 Accent 5" w:uiPriority="47"/>
+    <w:lsdException w:name="List Table 3 Accent 5" w:uiPriority="48"/>
+    <w:lsdException w:name="List Table 4 Accent 5" w:uiPriority="49"/>
+    <w:lsdException w:name="List Table 5 Dark Accent 5" w:uiPriority="50"/>
+    <w:lsdException w:name="List Table 6 Colorful Accent 5" w:uiPriority="51"/>
+    <w:lsdException w:name="List Table 7 Colorful Accent 5" w:uiPriority="52"/>
+    <w:lsdException w:name="List Table 1 Light Accent 6" w:uiPriority="46"/>
+    <w:lsdException w:name="List Table 2 Accent 6" w:uiPriority="47"/>
+    <w:lsdException w:name="List Table 3 Accent 6" w:uiPriority="48"/>
+    <w:lsdException w:name="List Table 4 Accent 6" w:uiPriority="49"/>
+    <w:lsdException w:name="List Table 5 Dark Accent 6" w:uiPriority="50"/>
+    <w:lsdException w:name="List Table 6 Colorful Accent 6" w:uiPriority="51"/>
+    <w:lsdException w:name="List Table 7 Colorful Accent 6" w:uiPriority="52"/>
+    <w:lsdException w:name="Mention" w:semiHidden="1" w:unhideWhenUsed="1"/>
+    <w:lsdException w:name="Smart Hyperlink" w:semiHidden="1" w:unhideWhenUsed="1"/>
+    <w:lsdException w:name="Hashtag" w:semiHidden="1" w:unhideWhenUsed="1"/>
+    <w:lsdException w:name="Unresolved Mention" w:semiHidden="1" w:unhideWhenUsed="1"/>
+    <w:lsdException w:name="Smart Link" w:semiHidden="1" w:unhideWhenUsed="1"/>
+  </w:latentStyles>
+  <w:style w:type="paragraph" w:default="1" w:styleId="Normal">
+    <w:name w:val="Normal"/>
     <w:qFormat/>
-    <w:rPr>
-      <w:sz w:val="56"/>
-      <w:szCs w:val="56"/>
-    </w:rPr>
   </w:style>
   <w:style w:type="paragraph" w:styleId="Heading1">
-    <w:name w:val="Heading 1"/>
-    <w:basedOn w:val="Normal"/>
-    <w:next w:val="Normal"/>
+    <w:name w:val="heading 1"/>
+    <w:uiPriority w:val="9"/>
     <w:qFormat/>
+    <w:pPr>
+      <w:outlineLvl w:val="0"/>
+    </w:pPr>
     <w:rPr>
       <w:color w:val="2E74B5"/>
       <w:sz w:val="32"/>
@@ -995,10 +1598,14 @@
     </w:rPr>
   </w:style>
   <w:style w:type="paragraph" w:styleId="Heading2">
-    <w:name w:val="Heading 2"/>
-    <w:basedOn w:val="Normal"/>
-    <w:next w:val="Normal"/>
+    <w:name w:val="heading 2"/>
+    <w:uiPriority w:val="9"/>
+    <w:semiHidden/>
+    <w:unhideWhenUsed/>
     <w:qFormat/>
+    <w:pPr>
+      <w:outlineLvl w:val="1"/>
+    </w:pPr>
     <w:rPr>
       <w:color w:val="2E74B5"/>
       <w:sz w:val="26"/>
@@ -1006,10 +1613,14 @@
     </w:rPr>
   </w:style>
   <w:style w:type="paragraph" w:styleId="Heading3">
-    <w:name w:val="Heading 3"/>
-    <w:basedOn w:val="Normal"/>
-    <w:next w:val="Normal"/>
+    <w:name w:val="heading 3"/>
+    <w:uiPriority w:val="9"/>
+    <w:semiHidden/>
+    <w:unhideWhenUsed/>
     <w:qFormat/>
+    <w:pPr>
+      <w:outlineLvl w:val="2"/>
+    </w:pPr>
     <w:rPr>
       <w:color w:val="1F4D78"/>
       <w:sz w:val="24"/>
@@ -1017,10 +1628,14 @@
     </w:rPr>
   </w:style>
   <w:style w:type="paragraph" w:styleId="Heading4">
-    <w:name w:val="Heading 4"/>
-    <w:basedOn w:val="Normal"/>
-    <w:next w:val="Normal"/>
+    <w:name w:val="heading 4"/>
+    <w:uiPriority w:val="9"/>
+    <w:semiHidden/>
+    <w:unhideWhenUsed/>
     <w:qFormat/>
+    <w:pPr>
+      <w:outlineLvl w:val="3"/>
+    </w:pPr>
     <w:rPr>
       <w:i/>
       <w:iCs/>
@@ -1028,27 +1643,69 @@
     </w:rPr>
   </w:style>
   <w:style w:type="paragraph" w:styleId="Heading5">
-    <w:name w:val="Heading 5"/>
-    <w:basedOn w:val="Normal"/>
-    <w:next w:val="Normal"/>
+    <w:name w:val="heading 5"/>
+    <w:uiPriority w:val="9"/>
+    <w:semiHidden/>
+    <w:unhideWhenUsed/>
     <w:qFormat/>
+    <w:pPr>
+      <w:outlineLvl w:val="4"/>
+    </w:pPr>
     <w:rPr>
       <w:color w:val="2E74B5"/>
     </w:rPr>
   </w:style>
   <w:style w:type="paragraph" w:styleId="Heading6">
-    <w:name w:val="Heading 6"/>
-    <w:basedOn w:val="Normal"/>
-    <w:next w:val="Normal"/>
+    <w:name w:val="heading 6"/>
+    <w:uiPriority w:val="9"/>
+    <w:semiHidden/>
+    <w:unhideWhenUsed/>
     <w:qFormat/>
+    <w:pPr>
+      <w:outlineLvl w:val="5"/>
+    </w:pPr>
     <w:rPr>
       <w:color w:val="1F4D78"/>
     </w:rPr>
   </w:style>
-  <w:style w:type="paragraph" w:styleId="Strong">
-    <w:name w:val="Strong"/>
-    <w:basedOn w:val="Normal"/>
-    <w:next w:val="Normal"/>
+  <w:style w:type="character" w:default="1" w:styleId="DefaultParagraphFont">
+    <w:name w:val="Default Paragraph Font"/>
+    <w:uiPriority w:val="1"/>
+    <w:semiHidden/>
+    <w:unhideWhenUsed/>
+  </w:style>
+  <w:style w:type="table" w:default="1" w:styleId="TableNormal">
+    <w:name w:val="Normal Table"/>
+    <w:uiPriority w:val="99"/>
+    <w:semiHidden/>
+    <w:unhideWhenUsed/>
+    <w:tblPr>
+      <w:tblInd w:w="0" w:type="dxa"/>
+      <w:tblCellMar>
+        <w:top w:w="0" w:type="dxa"/>
+        <w:left w:w="108" w:type="dxa"/>
+        <w:bottom w:w="0" w:type="dxa"/>
+        <w:right w:w="108" w:type="dxa"/>
+      </w:tblCellMar>
+    </w:tblPr>
+  </w:style>
+  <w:style w:type="numbering" w:default="1" w:styleId="NoList">
+    <w:name w:val="No List"/>
+    <w:uiPriority w:val="99"/>
+    <w:semiHidden/>
+    <w:unhideWhenUsed/>
+  </w:style>
+  <w:style w:type="paragraph" w:styleId="Title">
+    <w:name w:val="Title"/>
+    <w:uiPriority w:val="10"/>
+    <w:qFormat/>
+    <w:rPr>
+      <w:sz w:val="56"/>
+      <w:szCs w:val="56"/>
+    </w:rPr>
+  </w:style>
+  <w:style w:type="paragraph" w:customStyle="1" w:styleId="Strong1">
+    <w:name w:val="Strong1"/>
     <w:qFormat/>
     <w:rPr>
       <w:b/>
@@ -1057,12 +1714,10 @@
   </w:style>
   <w:style w:type="paragraph" w:styleId="ListParagraph">
     <w:name w:val="List Paragraph"/>
-    <w:basedOn w:val="Normal"/>
     <w:qFormat/>
   </w:style>
   <w:style w:type="character" w:styleId="Hyperlink">
     <w:name w:val="Hyperlink"/>
-    <w:basedOn w:val="DefaultParagraphFont"/>
     <w:uiPriority w:val="99"/>
     <w:unhideWhenUsed/>
     <w:rPr>
@@ -1072,7 +1727,6 @@
   </w:style>
   <w:style w:type="character" w:styleId="FootnoteReference">
     <w:name w:val="footnote reference"/>
-    <w:basedOn w:val="DefaultParagraphFont"/>
     <w:uiPriority w:val="99"/>
     <w:semiHidden/>
     <w:unhideWhenUsed/>
@@ -1082,22 +1736,13 @@
   </w:style>
   <w:style w:type="paragraph" w:styleId="FootnoteText">
     <w:name w:val="footnote text"/>
-    <w:basedOn w:val="Normal"/>
     <w:link w:val="FootnoteTextChar"/>
     <w:uiPriority w:val="99"/>
     <w:semiHidden/>
     <w:unhideWhenUsed/>
-    <w:pPr>
-      <w:spacing w:after="0" w:line="240" w:lineRule="auto"/>
-    </w:pPr>
-    <w:rPr>
-      <w:sz w:val="20"/>
-      <w:szCs w:val="20"/>
-    </w:rPr>
   </w:style>
-  <w:style w:type="character" w:styleId="FootnoteTextChar">
+  <w:style w:type="character" w:customStyle="1" w:styleId="FootnoteTextChar">
     <w:name w:val="Footnote Text Char"/>
-    <w:basedOn w:val="DefaultParagraphFont"/>
     <w:link w:val="FootnoteText"/>
     <w:uiPriority w:val="99"/>
     <w:semiHidden/>
@@ -1109,7 +1754,6 @@
   </w:style>
   <w:style w:type="character" w:styleId="EndnoteReference">
     <w:name w:val="endnote reference"/>
-    <w:basedOn w:val="DefaultParagraphFont"/>
     <w:uiPriority w:val="99"/>
     <w:semiHidden/>
     <w:unhideWhenUsed/>
@@ -1119,22 +1763,13 @@
   </w:style>
   <w:style w:type="paragraph" w:styleId="EndnoteText">
     <w:name w:val="endnote text"/>
-    <w:basedOn w:val="Normal"/>
     <w:link w:val="EndnoteTextChar"/>
     <w:uiPriority w:val="99"/>
     <w:semiHidden/>
     <w:unhideWhenUsed/>
-    <w:pPr>
-      <w:spacing w:after="0" w:line="240" w:lineRule="auto"/>
-    </w:pPr>
-    <w:rPr>
-      <w:sz w:val="20"/>
-      <w:szCs w:val="20"/>
-    </w:rPr>
   </w:style>
-  <w:style w:type="character" w:styleId="EndnoteTextChar">
+  <w:style w:type="character" w:customStyle="1" w:styleId="EndnoteTextChar">
     <w:name w:val="Endnote Text Char"/>
-    <w:basedOn w:val="DefaultParagraphFont"/>
     <w:link w:val="EndnoteText"/>
     <w:uiPriority w:val="99"/>
     <w:semiHidden/>
@@ -1145,4 +1780,299 @@
     </w:rPr>
   </w:style>
 </w:styles>
+</file>
+
+<file path=word/theme/theme1.xml><?xml version="1.0" encoding="utf-8"?>
+<a:theme xmlns:a="http://schemas.openxmlformats.org/drawingml/2006/main" name="Office Theme">
+  <a:themeElements>
+    <a:clrScheme name="Office">
+      <a:dk1>
+        <a:sysClr val="windowText" lastClr="000000"/>
+      </a:dk1>
+      <a:lt1>
+        <a:sysClr val="window" lastClr="FFFFFF"/>
+      </a:lt1>
+      <a:dk2>
+        <a:srgbClr val="0E2841"/>
+      </a:dk2>
+      <a:lt2>
+        <a:srgbClr val="E8E8E8"/>
+      </a:lt2>
+      <a:accent1>
+        <a:srgbClr val="156082"/>
+      </a:accent1>
+      <a:accent2>
+        <a:srgbClr val="E97132"/>
+      </a:accent2>
+      <a:accent3>
+        <a:srgbClr val="196B24"/>
+      </a:accent3>
+      <a:accent4>
+        <a:srgbClr val="0F9ED5"/>
+      </a:accent4>
+      <a:accent5>
+        <a:srgbClr val="A02B93"/>
+      </a:accent5>
+      <a:accent6>
+        <a:srgbClr val="4EA72E"/>
+      </a:accent6>
+      <a:hlink>
+        <a:srgbClr val="467886"/>
+      </a:hlink>
+      <a:folHlink>
+        <a:srgbClr val="96607D"/>
+      </a:folHlink>
+    </a:clrScheme>
+    <a:fontScheme name="Office">
+      <a:majorFont>
+        <a:latin typeface="Aptos Display" panose="02110004020202020204"/>
+        <a:ea typeface=""/>
+        <a:cs typeface=""/>
+        <a:font script="Jpan" typeface="游ゴシック Light"/>
+        <a:font script="Hang" typeface="맑은 고딕"/>
+        <a:font script="Hans" typeface="等线 Light"/>
+        <a:font script="Hant" typeface="新細明體"/>
+        <a:font script="Arab" typeface="Times New Roman"/>
+        <a:font script="Hebr" typeface="Times New Roman"/>
+        <a:font script="Thai" typeface="Angsana New"/>
+        <a:font script="Ethi" typeface="Nyala"/>
+        <a:font script="Beng" typeface="Vrinda"/>
+        <a:font script="Gujr" typeface="Shruti"/>
+        <a:font script="Khmr" typeface="MoolBoran"/>
+        <a:font script="Knda" typeface="Tunga"/>
+        <a:font script="Guru" typeface="Raavi"/>
+        <a:font script="Cans" typeface="Euphemia"/>
+        <a:font script="Cher" typeface="Plantagenet Cherokee"/>
+        <a:font script="Yiii" typeface="Microsoft Yi Baiti"/>
+        <a:font script="Tibt" typeface="Microsoft Himalaya"/>
+        <a:font script="Thaa" typeface="MV Boli"/>
+        <a:font script="Deva" typeface="Mangal"/>
+        <a:font script="Telu" typeface="Gautami"/>
+        <a:font script="Taml" typeface="Latha"/>
+        <a:font script="Syrc" typeface="Estrangelo Edessa"/>
+        <a:font script="Orya" typeface="Kalinga"/>
+        <a:font script="Mlym" typeface="Kartika"/>
+        <a:font script="Laoo" typeface="DokChampa"/>
+        <a:font script="Sinh" typeface="Iskoola Pota"/>
+        <a:font script="Mong" typeface="Mongolian Baiti"/>
+        <a:font script="Viet" typeface="Times New Roman"/>
+        <a:font script="Uigh" typeface="Microsoft Uighur"/>
+        <a:font script="Geor" typeface="Sylfaen"/>
+        <a:font script="Armn" typeface="Arial"/>
+        <a:font script="Bugi" typeface="Leelawadee UI"/>
+        <a:font script="Bopo" typeface="Microsoft JhengHei"/>
+        <a:font script="Java" typeface="Javanese Text"/>
+        <a:font script="Lisu" typeface="Segoe UI"/>
+        <a:font script="Mymr" typeface="Myanmar Text"/>
+        <a:font script="Nkoo" typeface="Ebrima"/>
+        <a:font script="Olck" typeface="Nirmala UI"/>
+        <a:font script="Osma" typeface="Ebrima"/>
+        <a:font script="Phag" typeface="Phagspa"/>
+        <a:font script="Syrn" typeface="Estrangelo Edessa"/>
+        <a:font script="Syrj" typeface="Estrangelo Edessa"/>
+        <a:font script="Syre" typeface="Estrangelo Edessa"/>
+        <a:font script="Sora" typeface="Nirmala UI"/>
+        <a:font script="Tale" typeface="Microsoft Tai Le"/>
+        <a:font script="Talu" typeface="Microsoft New Tai Lue"/>
+        <a:font script="Tfng" typeface="Ebrima"/>
+      </a:majorFont>
+      <a:minorFont>
+        <a:latin typeface="Aptos" panose="02110004020202020204"/>
+        <a:ea typeface=""/>
+        <a:cs typeface=""/>
+        <a:font script="Jpan" typeface="游明朝"/>
+        <a:font script="Hang" typeface="맑은 고딕"/>
+        <a:font script="Hans" typeface="等线"/>
+        <a:font script="Hant" typeface="新細明體"/>
+        <a:font script="Arab" typeface="Arial"/>
+        <a:font script="Hebr" typeface="Arial"/>
+        <a:font script="Thai" typeface="Cordia New"/>
+        <a:font script="Ethi" typeface="Nyala"/>
+        <a:font script="Beng" typeface="Vrinda"/>
+        <a:font script="Gujr" typeface="Shruti"/>
+        <a:font script="Khmr" typeface="DaunPenh"/>
+        <a:font script="Knda" typeface="Tunga"/>
+        <a:font script="Guru" typeface="Raavi"/>
+        <a:font script="Cans" typeface="Euphemia"/>
+        <a:font script="Cher" typeface="Plantagenet Cherokee"/>
+        <a:font script="Yiii" typeface="Microsoft Yi Baiti"/>
+        <a:font script="Tibt" typeface="Microsoft Himalaya"/>
+        <a:font script="Thaa" typeface="MV Boli"/>
+        <a:font script="Deva" typeface="Mangal"/>
+        <a:font script="Telu" typeface="Gautami"/>
+        <a:font script="Taml" typeface="Latha"/>
+        <a:font script="Syrc" typeface="Estrangelo Edessa"/>
+        <a:font script="Orya" typeface="Kalinga"/>
+        <a:font script="Mlym" typeface="Kartika"/>
+        <a:font script="Laoo" typeface="DokChampa"/>
+        <a:font script="Sinh" typeface="Iskoola Pota"/>
+        <a:font script="Mong" typeface="Mongolian Baiti"/>
+        <a:font script="Viet" typeface="Arial"/>
+        <a:font script="Uigh" typeface="Microsoft Uighur"/>
+        <a:font script="Geor" typeface="Sylfaen"/>
+        <a:font script="Armn" typeface="Arial"/>
+        <a:font script="Bugi" typeface="Leelawadee UI"/>
+        <a:font script="Bopo" typeface="Microsoft JhengHei"/>
+        <a:font script="Java" typeface="Javanese Text"/>
+        <a:font script="Lisu" typeface="Segoe UI"/>
+        <a:font script="Mymr" typeface="Myanmar Text"/>
+        <a:font script="Nkoo" typeface="Ebrima"/>
+        <a:font script="Olck" typeface="Nirmala UI"/>
+        <a:font script="Osma" typeface="Ebrima"/>
+        <a:font script="Phag" typeface="Phagspa"/>
+        <a:font script="Syrn" typeface="Estrangelo Edessa"/>
+        <a:font script="Syrj" typeface="Estrangelo Edessa"/>
+        <a:font script="Syre" typeface="Estrangelo Edessa"/>
+        <a:font script="Sora" typeface="Nirmala UI"/>
+        <a:font script="Tale" typeface="Microsoft Tai Le"/>
+        <a:font script="Talu" typeface="Microsoft New Tai Lue"/>
+        <a:font script="Tfng" typeface="Ebrima"/>
+      </a:minorFont>
+    </a:fontScheme>
+    <a:fmtScheme name="Office">
+      <a:fillStyleLst>
+        <a:solidFill>
+          <a:schemeClr val="phClr"/>
+        </a:solidFill>
+        <a:gradFill rotWithShape="1">
+          <a:gsLst>
+            <a:gs pos="0">
+              <a:schemeClr val="phClr">
+                <a:lumMod val="110000"/>
+                <a:satMod val="105000"/>
+                <a:tint val="67000"/>
+              </a:schemeClr>
+            </a:gs>
+            <a:gs pos="50000">
+              <a:schemeClr val="phClr">
+                <a:lumMod val="105000"/>
+                <a:satMod val="103000"/>
+                <a:tint val="73000"/>
+              </a:schemeClr>
+            </a:gs>
+            <a:gs pos="100000">
+              <a:schemeClr val="phClr">
+                <a:lumMod val="105000"/>
+                <a:satMod val="109000"/>
+                <a:tint val="81000"/>
+              </a:schemeClr>
+            </a:gs>
+          </a:gsLst>
+          <a:lin ang="5400000" scaled="0"/>
+        </a:gradFill>
+        <a:gradFill rotWithShape="1">
+          <a:gsLst>
+            <a:gs pos="0">
+              <a:schemeClr val="phClr">
+                <a:satMod val="103000"/>
+                <a:lumMod val="102000"/>
+                <a:tint val="94000"/>
+              </a:schemeClr>
+            </a:gs>
+            <a:gs pos="50000">
+              <a:schemeClr val="phClr">
+                <a:satMod val="110000"/>
+                <a:lumMod val="100000"/>
+                <a:shade val="100000"/>
+              </a:schemeClr>
+            </a:gs>
+            <a:gs pos="100000">
+              <a:schemeClr val="phClr">
+                <a:lumMod val="99000"/>
+                <a:satMod val="120000"/>
+                <a:shade val="78000"/>
+              </a:schemeClr>
+            </a:gs>
+          </a:gsLst>
+          <a:lin ang="5400000" scaled="0"/>
+        </a:gradFill>
+      </a:fillStyleLst>
+      <a:lnStyleLst>
+        <a:ln w="6350" cap="flat" cmpd="sng" algn="ctr">
+          <a:solidFill>
+            <a:schemeClr val="phClr"/>
+          </a:solidFill>
+          <a:prstDash val="solid"/>
+          <a:miter lim="800000"/>
+        </a:ln>
+        <a:ln w="12700" cap="flat" cmpd="sng" algn="ctr">
+          <a:solidFill>
+            <a:schemeClr val="phClr"/>
+          </a:solidFill>
+          <a:prstDash val="solid"/>
+          <a:miter lim="800000"/>
+        </a:ln>
+        <a:ln w="19050" cap="flat" cmpd="sng" algn="ctr">
+          <a:solidFill>
+            <a:schemeClr val="phClr"/>
+          </a:solidFill>
+          <a:prstDash val="solid"/>
+          <a:miter lim="800000"/>
+        </a:ln>
+      </a:lnStyleLst>
+      <a:effectStyleLst>
+        <a:effectStyle>
+          <a:effectLst/>
+        </a:effectStyle>
+        <a:effectStyle>
+          <a:effectLst/>
+        </a:effectStyle>
+        <a:effectStyle>
+          <a:effectLst>
+            <a:outerShdw blurRad="57150" dist="19050" dir="5400000" algn="ctr" rotWithShape="0">
+              <a:srgbClr val="000000">
+                <a:alpha val="63000"/>
+              </a:srgbClr>
+            </a:outerShdw>
+          </a:effectLst>
+        </a:effectStyle>
+      </a:effectStyleLst>
+      <a:bgFillStyleLst>
+        <a:solidFill>
+          <a:schemeClr val="phClr"/>
+        </a:solidFill>
+        <a:solidFill>
+          <a:schemeClr val="phClr">
+            <a:tint val="95000"/>
+            <a:satMod val="170000"/>
+          </a:schemeClr>
+        </a:solidFill>
+        <a:gradFill rotWithShape="1">
+          <a:gsLst>
+            <a:gs pos="0">
+              <a:schemeClr val="phClr">
+                <a:tint val="93000"/>
+                <a:satMod val="150000"/>
+                <a:shade val="98000"/>
+                <a:lumMod val="102000"/>
+              </a:schemeClr>
+            </a:gs>
+            <a:gs pos="50000">
+              <a:schemeClr val="phClr">
+                <a:tint val="98000"/>
+                <a:satMod val="130000"/>
+                <a:shade val="90000"/>
+                <a:lumMod val="103000"/>
+              </a:schemeClr>
+            </a:gs>
+            <a:gs pos="100000">
+              <a:schemeClr val="phClr">
+                <a:shade val="63000"/>
+                <a:satMod val="120000"/>
+              </a:schemeClr>
+            </a:gs>
+          </a:gsLst>
+          <a:lin ang="5400000" scaled="0"/>
+        </a:gradFill>
+      </a:bgFillStyleLst>
+    </a:fmtScheme>
+  </a:themeElements>
+  <a:objectDefaults/>
+  <a:extraClrSchemeLst/>
+  <a:extLst>
+    <a:ext uri="{05A4C25C-085E-4340-85A3-A5531E510DB2}">
+      <thm15:themeFamily xmlns:thm15="http://schemas.microsoft.com/office/thememl/2012/main" name="Office Theme" id="{2E142A2C-CD16-42D6-873A-C26D2A0506FA}" vid="{1BDDFF52-6CD6-40A5-AB3C-68EB2F1E4D0A}"/>
+    </a:ext>
+  </a:extLst>
+</a:theme>
 </file>
</xml_diff>